<commit_message>
feat: La Salle (orthographe officielle), Figure II.1 en PNG matplotlib (boîtes propres au lieu d'ASCII)
</commit_message>
<xml_diff>
--- a/memoire/memoire_v4.docx
+++ b/memoire/memoire_v4.docx
@@ -439,7 +439,7 @@
         <w:pStyle w:val="FirstParagraph"/>
       </w:pPr>
       <w:r>
-        <w:t xml:space="preserve">Au terme de notre formation pour l’obtention du Master II en Maintenance Industrielle, nous tenons à exprimer notre sincère reconnaissance à l’ensemble du corps professoral de l’École Supérieure Technique Lasalle, qui par la qualité de leur enseignement et de leur encadrement, nous a permis de terminer avec succès cette formation en ingénierie. En l’occurrence :</w:t>
+        <w:t xml:space="preserve">Au terme de notre formation pour l’obtention du Master II en Maintenance Industrielle, nous tenons à exprimer notre sincère reconnaissance à l’ensemble du corps professoral de l’École Supérieure Technique La Salle, qui par la qualité de leur enseignement et de leur encadrement, nous a permis de terminer avec succès cette formation en ingénierie. En l’occurrence :</w:t>
       </w:r>
     </w:p>
     <w:p>
@@ -1732,7 +1732,7 @@
               <w:pStyle w:val="Compact"/>
             </w:pPr>
             <w:r>
-              <w:t xml:space="preserve">École Supérieure Technique Lasalle</w:t>
+              <w:t xml:space="preserve">École Supérieure Technique La Salle</w:t>
             </w:r>
           </w:p>
         </w:tc>
@@ -6126,7 +6126,7 @@
           <w:b/>
           <w:bCs/>
         </w:rPr>
-        <w:t xml:space="preserve">Pour l’École Supérieure Technique Lasalle (ESTL) :</w:t>
+        <w:t xml:space="preserve">Pour l’École Supérieure Technique La Salle (ESTL) :</w:t>
       </w:r>
       <w:r>
         <w:t xml:space="preserve"> </w:t>
@@ -10150,7 +10150,7 @@
     </w:p>
     <w:bookmarkEnd w:id="45"/>
     <w:bookmarkEnd w:id="46"/>
-    <w:bookmarkStart w:id="96" w:name="chapitre-ii-outils-et-méthodes"/>
+    <w:bookmarkStart w:id="99" w:name="chapitre-ii-outils-et-méthodes"/>
     <w:p>
       <w:pPr>
         <w:pStyle w:val="Heading1"/>
@@ -13121,7 +13121,7 @@
           <w:b/>
           <w:bCs/>
         </w:rPr>
-        <w:t xml:space="preserve">École Supérieure Technique Lasalle (ESTL)</w:t>
+        <w:t xml:space="preserve">École Supérieure Technique La Salle (ESTL)</w:t>
       </w:r>
       <w:r>
         <w:t xml:space="preserve">. La validation expérimentale est conduite en laboratoire à Douala. La projection industrielle vise le contexte applicatif de la</w:t>
@@ -21921,7 +21921,7 @@
     </w:p>
     <w:bookmarkEnd w:id="85"/>
     <w:bookmarkEnd w:id="86"/>
-    <w:bookmarkStart w:id="93" w:name="X358e7e995ad73683a6412031f4f03c34e5efee7"/>
+    <w:bookmarkStart w:id="96" w:name="X358e7e995ad73683a6412031f4f03c34e5efee7"/>
     <w:p>
       <w:pPr>
         <w:pStyle w:val="Heading2"/>
@@ -23221,7 +23221,7 @@
       </w:r>
     </w:p>
     <w:bookmarkEnd w:id="89"/>
-    <w:bookmarkStart w:id="90" w:name="X3074847b1602fc8740aedbd5f3227b4dd48acd3"/>
+    <w:bookmarkStart w:id="93" w:name="X3074847b1602fc8740aedbd5f3227b4dd48acd3"/>
     <w:p>
       <w:pPr>
         <w:pStyle w:val="Heading3"/>
@@ -23232,30 +23232,61 @@
     </w:p>
     <w:p>
       <w:pPr>
-        <w:pStyle w:val="FirstParagraph"/>
-      </w:pPr>
-      <w:r>
-        <w:rPr>
-          <w:b/>
-          <w:bCs/>
-        </w:rPr>
-        <w:t xml:space="preserve">Figure II.1 — Architecture de la boucle intégrée Sonde → Supabase → Streamlit → CMMS open-source</w:t>
-      </w:r>
-    </w:p>
-    <w:p>
-      <w:pPr>
-        <w:pStyle w:val="BodyText"/>
-      </w:pPr>
-      <w:r>
-        <w:rPr>
-          <w:i/>
-          <w:iCs/>
-        </w:rPr>
-        <w:t xml:space="preserve">[Figure à compléter]</w:t>
-      </w:r>
-    </w:p>
-    <w:bookmarkEnd w:id="90"/>
-    <w:bookmarkStart w:id="91" w:name="X7b4697db37a967a1cc93fab82402694227ed967"/>
+        <w:pStyle w:val="CaptionedFigure"/>
+      </w:pPr>
+      <w:r>
+        <w:drawing>
+          <wp:inline>
+            <wp:extent cx="4267200" cy="5224261"/>
+            <wp:effectExtent b="0" l="0" r="0" t="0"/>
+            <wp:docPr descr="Figure II.1 — Architecture de la boucle intégrée Sonde ER → Supabase → Streamlit → CMMS open-source" title="" id="91" name="Picture"/>
+            <a:graphic>
+              <a:graphicData uri="http://schemas.openxmlformats.org/drawingml/2006/picture">
+                <pic:pic>
+                  <pic:nvPicPr>
+                    <pic:cNvPr descr="figures/fig_ii1_architecture.png" id="92" name="Picture"/>
+                    <pic:cNvPicPr>
+                      <a:picLocks noChangeArrowheads="1" noChangeAspect="1"/>
+                    </pic:cNvPicPr>
+                  </pic:nvPicPr>
+                  <pic:blipFill>
+                    <a:blip r:embed="rId90"/>
+                    <a:stretch>
+                      <a:fillRect/>
+                    </a:stretch>
+                  </pic:blipFill>
+                  <pic:spPr bwMode="auto">
+                    <a:xfrm>
+                      <a:off x="0" y="0"/>
+                      <a:ext cx="4267200" cy="5224261"/>
+                    </a:xfrm>
+                    <a:prstGeom prst="rect">
+                      <a:avLst/>
+                    </a:prstGeom>
+                    <a:noFill/>
+                    <a:ln w="9525">
+                      <a:noFill/>
+                      <a:headEnd/>
+                      <a:tailEnd/>
+                    </a:ln>
+                  </pic:spPr>
+                </pic:pic>
+              </a:graphicData>
+            </a:graphic>
+          </wp:inline>
+        </w:drawing>
+      </w:r>
+    </w:p>
+    <w:p>
+      <w:pPr>
+        <w:pStyle w:val="ImageCaption"/>
+      </w:pPr>
+      <w:r>
+        <w:t xml:space="preserve">Figure II.1 — Architecture de la boucle intégrée Sonde ER → Supabase → Streamlit → CMMS open-source</w:t>
+      </w:r>
+    </w:p>
+    <w:bookmarkEnd w:id="93"/>
+    <w:bookmarkStart w:id="94" w:name="X7b4697db37a967a1cc93fab82402694227ed967"/>
     <w:p>
       <w:pPr>
         <w:pStyle w:val="Heading3"/>
@@ -24030,8 +24061,8 @@
         <w:t xml:space="preserve">ticket)</w:t>
       </w:r>
     </w:p>
-    <w:bookmarkEnd w:id="91"/>
-    <w:bookmarkStart w:id="92" w:name="X6daa42d570212a4ddf8cec02ed6ecb7bd6e7228"/>
+    <w:bookmarkEnd w:id="94"/>
+    <w:bookmarkStart w:id="95" w:name="X6daa42d570212a4ddf8cec02ed6ecb7bd6e7228"/>
     <w:p>
       <w:pPr>
         <w:pStyle w:val="Heading3"/>
@@ -24514,9 +24545,9 @@
         </w:pict>
       </w:r>
     </w:p>
-    <w:bookmarkEnd w:id="92"/>
-    <w:bookmarkEnd w:id="93"/>
-    <w:bookmarkStart w:id="94" w:name="X0fcd5b5066ea3b0aa0fe0eb42347356d14c3aaf"/>
+    <w:bookmarkEnd w:id="95"/>
+    <w:bookmarkEnd w:id="96"/>
+    <w:bookmarkStart w:id="97" w:name="X0fcd5b5066ea3b0aa0fe0eb42347356d14c3aaf"/>
     <w:p>
       <w:pPr>
         <w:pStyle w:val="Heading2"/>
@@ -24988,8 +25019,8 @@
         </w:pict>
       </w:r>
     </w:p>
-    <w:bookmarkEnd w:id="94"/>
-    <w:bookmarkStart w:id="95" w:name="ii.9.-conclusion-du-chapitre-ii"/>
+    <w:bookmarkEnd w:id="97"/>
+    <w:bookmarkStart w:id="98" w:name="ii.9.-conclusion-du-chapitre-ii"/>
     <w:p>
       <w:pPr>
         <w:pStyle w:val="Heading2"/>
@@ -25083,9 +25114,9 @@
         <w:t xml:space="preserve">présente à présent les résultats issus de la mise en œuvre de cette méthodologie, leur analyse et leur discussion.</w:t>
       </w:r>
     </w:p>
-    <w:bookmarkEnd w:id="95"/>
-    <w:bookmarkEnd w:id="96"/>
-    <w:bookmarkStart w:id="138" w:name="chapitre-iii-résultats-et-discussions"/>
+    <w:bookmarkEnd w:id="98"/>
+    <w:bookmarkEnd w:id="99"/>
+    <w:bookmarkStart w:id="141" w:name="chapitre-iii-résultats-et-discussions"/>
     <w:p>
       <w:pPr>
         <w:pStyle w:val="Heading1"/>
@@ -25221,7 +25252,7 @@
         </w:pict>
       </w:r>
     </w:p>
-    <w:bookmarkStart w:id="97" w:name="iii.0.-introduction"/>
+    <w:bookmarkStart w:id="100" w:name="iii.0.-introduction"/>
     <w:p>
       <w:pPr>
         <w:pStyle w:val="Heading2"/>
@@ -25279,8 +25310,8 @@
         </w:pict>
       </w:r>
     </w:p>
-    <w:bookmarkEnd w:id="97"/>
-    <w:bookmarkStart w:id="102" w:name="X39f727902a9cb6c8b752dcc901c68810ace20c1"/>
+    <w:bookmarkEnd w:id="100"/>
+    <w:bookmarkStart w:id="105" w:name="X39f727902a9cb6c8b752dcc901c68810ace20c1"/>
     <w:p>
       <w:pPr>
         <w:pStyle w:val="Heading2"/>
@@ -25289,7 +25320,7 @@
         <w:t xml:space="preserve">III.1. Validation métrologi que de la sonde ER (OS1)</w:t>
       </w:r>
     </w:p>
-    <w:bookmarkStart w:id="98" w:name="Xfbd2fff90ecadeede27324a11c87b55596e05af"/>
+    <w:bookmarkStart w:id="101" w:name="Xfbd2fff90ecadeede27324a11c87b55596e05af"/>
     <w:p>
       <w:pPr>
         <w:pStyle w:val="Heading3"/>
@@ -25310,8 +25341,8 @@
         <w:t xml:space="preserve">[À compléter — Protocole : immersion du fil dans de l’eau distillée pendant 24 h, mesure de Rx(t). Insérer : graphe Rx(t) sur 24 h, calcul de l’écart-type σ_Rx (mΩ), vérification que σ_Rx &lt; 0,01 mΩ.]</w:t>
       </w:r>
     </w:p>
-    <w:bookmarkEnd w:id="98"/>
-    <w:bookmarkStart w:id="99" w:name="X9798bcadc97144aaf05180f3aab863ab053a2c1"/>
+    <w:bookmarkEnd w:id="101"/>
+    <w:bookmarkStart w:id="102" w:name="X9798bcadc97144aaf05180f3aab863ab053a2c1"/>
     <w:p>
       <w:pPr>
         <w:pStyle w:val="Heading3"/>
@@ -25332,8 +25363,8 @@
         <w:t xml:space="preserve">[À compléter — Protocole : substitution du fil par 5 résistances de précision (0,1 Ω, 0,2 Ω, 0,5 Ω, 1,0 Ω, 2,0 Ω). Insérer : tableau comparatif HX711 vs valeur étalon, graphe linéarité, calcul de l’erreur relative moyenne (%).]</w:t>
       </w:r>
     </w:p>
-    <w:bookmarkEnd w:id="99"/>
-    <w:bookmarkStart w:id="100" w:name="Xf3f9dca319410a6ac55cc577b8ca02fdf33596c"/>
+    <w:bookmarkEnd w:id="102"/>
+    <w:bookmarkStart w:id="103" w:name="Xf3f9dca319410a6ac55cc577b8ca02fdf33596c"/>
     <w:p>
       <w:pPr>
         <w:pStyle w:val="Heading3"/>
@@ -25354,8 +25385,8 @@
         <w:t xml:space="preserve">[À compléter — Protocole : variation contrôlée de la température de 22 °C à 32 °C, mesure simultanée Rx_brut et Rx_corr. Insérer : courbe Rx_brut(T) et Rx_corr(T) — démontrer que la pente Rx_corr(T) est &lt; 1 % de la pente Rx_brut(T).]</w:t>
       </w:r>
     </w:p>
-    <w:bookmarkEnd w:id="100"/>
-    <w:bookmarkStart w:id="101" w:name="Xc61a47e6fb031cca5d5ed31958ac0d55c70bb9c"/>
+    <w:bookmarkEnd w:id="103"/>
+    <w:bookmarkStart w:id="104" w:name="Xc61a47e6fb031cca5d5ed31958ac0d55c70bb9c"/>
     <w:p>
       <w:pPr>
         <w:pStyle w:val="Heading3"/>
@@ -25383,9 +25414,9 @@
         </w:pict>
       </w:r>
     </w:p>
-    <w:bookmarkEnd w:id="101"/>
-    <w:bookmarkEnd w:id="102"/>
-    <w:bookmarkStart w:id="108" w:name="X0bce19cb0866722ea309888a58a01622b4d7900"/>
+    <w:bookmarkEnd w:id="104"/>
+    <w:bookmarkEnd w:id="105"/>
+    <w:bookmarkStart w:id="111" w:name="X0bce19cb0866722ea309888a58a01622b4d7900"/>
     <w:p>
       <w:pPr>
         <w:pStyle w:val="Heading2"/>
@@ -25394,7 +25425,7 @@
         <w:t xml:space="preserve">III.2. Résultats des quatre runs run-to-failure (OS2)</w:t>
       </w:r>
     </w:p>
-    <w:bookmarkStart w:id="103" w:name="X3b3d9eba5f9981291fe0ec98b42271b1e9d2268"/>
+    <w:bookmarkStart w:id="106" w:name="X3b3d9eba5f9981291fe0ec98b42271b1e9d2268"/>
     <w:p>
       <w:pPr>
         <w:pStyle w:val="Heading3"/>
@@ -25415,8 +25446,8 @@
         <w:t xml:space="preserve">[À compléter — Insérer : (i) graphe Rx(t) sur la durée du run, (ii) graphe CR_lisse(t), (iii) graphe T(t). Indicateurs : durée totale du run (h), Rx initial (Ω), Rx à la rupture (Ω), CR moyen (mm/an), CR maximum (mm/an), photographie du fil après rupture.]</w:t>
       </w:r>
     </w:p>
-    <w:bookmarkEnd w:id="103"/>
-    <w:bookmarkStart w:id="104" w:name="Xede53b9c140fb1eff8d500bb1b1dba20d8f1cad"/>
+    <w:bookmarkEnd w:id="106"/>
+    <w:bookmarkStart w:id="107" w:name="Xede53b9c140fb1eff8d500bb1b1dba20d8f1cad"/>
     <w:p>
       <w:pPr>
         <w:pStyle w:val="Heading3"/>
@@ -25437,8 +25468,8 @@
         <w:t xml:space="preserve">[À compléter — Idem Run 1. Tableau comparatif Run 1 vs Run 2 : durée, CR moyen, CR max, Rx_rupture. Discussion de la reproductibilité.]</w:t>
       </w:r>
     </w:p>
-    <w:bookmarkEnd w:id="104"/>
-    <w:bookmarkStart w:id="105" w:name="Xae545383e689d4c0657cf2f5391fc242d7a9423"/>
+    <w:bookmarkEnd w:id="107"/>
+    <w:bookmarkStart w:id="108" w:name="Xae545383e689d4c0657cf2f5391fc242d7a9423"/>
     <w:p>
       <w:pPr>
         <w:pStyle w:val="Heading3"/>
@@ -25459,8 +25490,8 @@
         <w:t xml:space="preserve">[À compléter — Insérer : graphe Rx(t) avec annotation du temps d’injection de l’inhibiteur (t_injection) et du temps d’adsorption détecté (t_adsorption). Calcul de Δt_adsorption = t_adsorption - t_injection. Calcul de l’efficacité d’inhibition η₁ = (CR_avant - CR_après) / CR_avant × 100.]</w:t>
       </w:r>
     </w:p>
-    <w:bookmarkEnd w:id="105"/>
-    <w:bookmarkStart w:id="106" w:name="Xd48910367acf00fc42b0d520ef39f968f60675b"/>
+    <w:bookmarkEnd w:id="108"/>
+    <w:bookmarkStart w:id="109" w:name="Xd48910367acf00fc42b0d520ef39f968f60675b"/>
     <w:p>
       <w:pPr>
         <w:pStyle w:val="Heading3"/>
@@ -25481,8 +25512,8 @@
         <w:t xml:space="preserve">[À compléter — Idem Run 3. Calcul η₂. Comparaison η₁ vs η₂. Vérification de la relation dose-efficacité (loi de Langmuir attendue).]</w:t>
       </w:r>
     </w:p>
-    <w:bookmarkEnd w:id="106"/>
-    <w:bookmarkStart w:id="107" w:name="iii.2.5.-synthèse-des-quatre-runs"/>
+    <w:bookmarkEnd w:id="109"/>
+    <w:bookmarkStart w:id="110" w:name="iii.2.5.-synthèse-des-quatre-runs"/>
     <w:p>
       <w:pPr>
         <w:pStyle w:val="Heading3"/>
@@ -25510,9 +25541,9 @@
         </w:pict>
       </w:r>
     </w:p>
-    <w:bookmarkEnd w:id="107"/>
-    <w:bookmarkEnd w:id="108"/>
-    <w:bookmarkStart w:id="112" w:name="iii.3.-performance-du-modèle-xgboost-os2"/>
+    <w:bookmarkEnd w:id="110"/>
+    <w:bookmarkEnd w:id="111"/>
+    <w:bookmarkStart w:id="115" w:name="iii.3.-performance-du-modèle-xgboost-os2"/>
     <w:p>
       <w:pPr>
         <w:pStyle w:val="Heading2"/>
@@ -25521,7 +25552,7 @@
         <w:t xml:space="preserve">III.3. Performance du modèle XGBoost (OS2)</w:t>
       </w:r>
     </w:p>
-    <w:bookmarkStart w:id="109" w:name="X3b01179fbe63babff5ba25a4654c56ce257327e"/>
+    <w:bookmarkStart w:id="112" w:name="X3b01179fbe63babff5ba25a4654c56ce257327e"/>
     <w:p>
       <w:pPr>
         <w:pStyle w:val="Heading3"/>
@@ -26138,8 +26169,8 @@
         <w:t xml:space="preserve">[Même structure pour RUL.]</w:t>
       </w:r>
     </w:p>
-    <w:bookmarkEnd w:id="109"/>
-    <w:bookmarkStart w:id="110" w:name="iii.3.2.-courbes-prédites-vs-observées"/>
+    <w:bookmarkEnd w:id="112"/>
+    <w:bookmarkStart w:id="113" w:name="iii.3.2.-courbes-prédites-vs-observées"/>
     <w:p>
       <w:pPr>
         <w:pStyle w:val="Heading3"/>
@@ -26160,8 +26191,8 @@
         <w:t xml:space="preserve">[À compléter — Graphes scatter plot CR_prédit vs CR_observé et RUL_prédit vs RUL_observé, avec diagonale idéale et bandes ±15 %.]</w:t>
       </w:r>
     </w:p>
-    <w:bookmarkEnd w:id="110"/>
-    <w:bookmarkStart w:id="111" w:name="X2159342e28147cb832fdb7750aa47e2f35fe05a"/>
+    <w:bookmarkEnd w:id="113"/>
+    <w:bookmarkStart w:id="114" w:name="X2159342e28147cb832fdb7750aa47e2f35fe05a"/>
     <w:p>
       <w:pPr>
         <w:pStyle w:val="Heading3"/>
@@ -26189,9 +26220,9 @@
         </w:pict>
       </w:r>
     </w:p>
-    <w:bookmarkEnd w:id="111"/>
-    <w:bookmarkEnd w:id="112"/>
-    <w:bookmarkStart w:id="119" w:name="X0e9b8e8700ad5976390801244ba383e93b1da33"/>
+    <w:bookmarkEnd w:id="114"/>
+    <w:bookmarkEnd w:id="115"/>
+    <w:bookmarkStart w:id="122" w:name="X0e9b8e8700ad5976390801244ba383e93b1da33"/>
     <w:p>
       <w:pPr>
         <w:pStyle w:val="Heading2"/>
@@ -26200,7 +26231,7 @@
         <w:t xml:space="preserve">III.4. Diagnostic des régimes de corrosion (OS3)</w:t>
       </w:r>
     </w:p>
-    <w:bookmarkStart w:id="113" w:name="iii.4.1.-détection-du-régime-stable"/>
+    <w:bookmarkStart w:id="116" w:name="iii.4.1.-détection-du-régime-stable"/>
     <w:p>
       <w:pPr>
         <w:pStyle w:val="Heading3"/>
@@ -26221,8 +26252,8 @@
         <w:t xml:space="preserve">[À compléter — Identification des plages temporelles classifiées « stable » dans les runs 1 et 2. Vérification de la cohérence des seuils empiriques (dR/dt &lt; seuil_stable, tendance_6h ≈ 0).]</w:t>
       </w:r>
     </w:p>
-    <w:bookmarkEnd w:id="113"/>
-    <w:bookmarkStart w:id="114" w:name="X33ac9f7d4d6d075bcc8a23c1d27771c36121776"/>
+    <w:bookmarkEnd w:id="116"/>
+    <w:bookmarkStart w:id="117" w:name="X33ac9f7d4d6d075bcc8a23c1d27771c36121776"/>
     <w:p>
       <w:pPr>
         <w:pStyle w:val="Heading3"/>
@@ -26243,8 +26274,8 @@
         <w:t xml:space="preserve">[À compléter — Identification des phases d’accélération de la corrosion sans inhibiteur. Graphe CR(t) avec annotation des fenêtres classifiées « accélération ».]</w:t>
       </w:r>
     </w:p>
-    <w:bookmarkEnd w:id="114"/>
-    <w:bookmarkStart w:id="115" w:name="X4576a1f1645e91fe985912a5ddb0c2099f28ad1"/>
+    <w:bookmarkEnd w:id="117"/>
+    <w:bookmarkStart w:id="118" w:name="X4576a1f1645e91fe985912a5ddb0c2099f28ad1"/>
     <w:p>
       <w:pPr>
         <w:pStyle w:val="Heading3"/>
@@ -26265,8 +26296,8 @@
         <w:t xml:space="preserve">[À compléter — Identification d’éventuelles phases de passivation observées (CR qui décélère sans inhibiteur). Hypothèse : formation d’un film de phosphate de fer par H₃PO₄. À confirmer par observation visuelle du fil après run.]</w:t>
       </w:r>
     </w:p>
-    <w:bookmarkEnd w:id="115"/>
-    <w:bookmarkStart w:id="116" w:name="X467110b5a02a54db8c09bb4730d3c9d17c26ba5"/>
+    <w:bookmarkEnd w:id="118"/>
+    <w:bookmarkStart w:id="119" w:name="X467110b5a02a54db8c09bb4730d3c9d17c26ba5"/>
     <w:p>
       <w:pPr>
         <w:pStyle w:val="Heading3"/>
@@ -26287,8 +26318,8 @@
         <w:t xml:space="preserve">[À compléter — Pour les runs 3 et 4 : détection du changepoint et classification automatique du régime « adsorption inhibiteur ». Comparaison avec le moment d’injection réel.]</w:t>
       </w:r>
     </w:p>
-    <w:bookmarkEnd w:id="116"/>
-    <w:bookmarkStart w:id="117" w:name="iii.4.5.-détection-du-régime-pré-rupture"/>
+    <w:bookmarkEnd w:id="119"/>
+    <w:bookmarkStart w:id="120" w:name="iii.4.5.-détection-du-régime-pré-rupture"/>
     <w:p>
       <w:pPr>
         <w:pStyle w:val="Heading3"/>
@@ -26309,8 +26340,8 @@
         <w:t xml:space="preserve">[À compléter — Identification des dernières heures avant rupture sur chaque run. Vérification que l’algorithme classifie bien ces fenêtres en « pré-rupture » (RUL &lt; 12 h, dR/dt diverge).]</w:t>
       </w:r>
     </w:p>
-    <w:bookmarkEnd w:id="117"/>
-    <w:bookmarkStart w:id="118" w:name="X8980563796bda59eb74bee35ff0652ea2d66b97"/>
+    <w:bookmarkEnd w:id="120"/>
+    <w:bookmarkStart w:id="121" w:name="X8980563796bda59eb74bee35ff0652ea2d66b97"/>
     <w:p>
       <w:pPr>
         <w:pStyle w:val="Heading3"/>
@@ -26338,9 +26369,9 @@
         </w:pict>
       </w:r>
     </w:p>
-    <w:bookmarkEnd w:id="118"/>
-    <w:bookmarkEnd w:id="119"/>
-    <w:bookmarkStart w:id="123" w:name="Xdd0ae0adf38e9d2a01c3df6274655612da32466"/>
+    <w:bookmarkEnd w:id="121"/>
+    <w:bookmarkEnd w:id="122"/>
+    <w:bookmarkStart w:id="126" w:name="Xdd0ae0adf38e9d2a01c3df6274655612da32466"/>
     <w:p>
       <w:pPr>
         <w:pStyle w:val="Heading2"/>
@@ -26349,7 +26380,7 @@
         <w:t xml:space="preserve">III.5. Évaluation de l’inhibiteur de corrosion et calibration des alertes (OS3)</w:t>
       </w:r>
     </w:p>
-    <w:bookmarkStart w:id="120" w:name="X014464e17f8159f8835c46ac12dee1b4623282f"/>
+    <w:bookmarkStart w:id="123" w:name="X014464e17f8159f8835c46ac12dee1b4623282f"/>
     <w:p>
       <w:pPr>
         <w:pStyle w:val="Heading3"/>
@@ -26370,8 +26401,8 @@
         <w:t xml:space="preserve">[À compléter — Pour les runs 3 et 4 : graphe CR_lisse(t) avec marqueur du changepoint détecté par l’algorithme (chute ≥ 30 % par rapport à la baseline). Comparaison avec t_injection réel. Calcul de Δt_adsorption et discussion (cohérence avec la cinétique de Langmuir).]</w:t>
       </w:r>
     </w:p>
-    <w:bookmarkEnd w:id="120"/>
-    <w:bookmarkStart w:id="121" w:name="Xf285c867fa7c61d7bfd8030a48c41f58e4e7eb5"/>
+    <w:bookmarkEnd w:id="123"/>
+    <w:bookmarkStart w:id="124" w:name="Xf285c867fa7c61d7bfd8030a48c41f58e4e7eb5"/>
     <w:p>
       <w:pPr>
         <w:pStyle w:val="Heading3"/>
@@ -26558,8 +26589,8 @@
         <w:t xml:space="preserve">Discussion des écarts au regard de la composition multi-acide (HCl + H₃PO₄) vs HCl pur des essais fabricant — l’efficacité réelle peut être réduite par l’environnement multi-mécanismes.]</w:t>
       </w:r>
     </w:p>
-    <w:bookmarkEnd w:id="121"/>
-    <w:bookmarkStart w:id="122" w:name="X13f69ce28fd6052b81492647f4edaef3b093a7b"/>
+    <w:bookmarkEnd w:id="124"/>
+    <w:bookmarkStart w:id="125" w:name="X13f69ce28fd6052b81492647f4edaef3b093a7b"/>
     <w:p>
       <w:pPr>
         <w:pStyle w:val="Heading3"/>
@@ -26587,9 +26618,9 @@
         </w:pict>
       </w:r>
     </w:p>
-    <w:bookmarkEnd w:id="122"/>
-    <w:bookmarkEnd w:id="123"/>
-    <w:bookmarkStart w:id="130" w:name="X074284278962b68559762a8516c6a8420c6ece4"/>
+    <w:bookmarkEnd w:id="125"/>
+    <w:bookmarkEnd w:id="126"/>
+    <w:bookmarkStart w:id="133" w:name="X074284278962b68559762a8516c6a8420c6ece4"/>
     <w:p>
       <w:pPr>
         <w:pStyle w:val="Heading2"/>
@@ -26598,7 +26629,7 @@
         <w:t xml:space="preserve">III.6. Intégration au CMMS open-source — démonstration end-to-end et KPIs (OS4)</w:t>
       </w:r>
     </w:p>
-    <w:bookmarkStart w:id="124" w:name="Xe1464985cc037fe747a2001eae0b971ebe4121d"/>
+    <w:bookmarkStart w:id="127" w:name="Xe1464985cc037fe747a2001eae0b971ebe4121d"/>
     <w:p>
       <w:pPr>
         <w:pStyle w:val="Heading3"/>
@@ -26619,8 +26650,8 @@
         <w:t xml:space="preserve">[À compléter — Capture d’écran ou schéma graphique des huit tables Supabase déployées (assets, measurements, predictions, alerts, work_orders, interventions, inhibitor_doses, kpi_maintenance). Vérification de l’intégrité référentielle.]</w:t>
       </w:r>
     </w:p>
-    <w:bookmarkEnd w:id="124"/>
-    <w:bookmarkStart w:id="125" w:name="X529041c1036c1fbb9478ce4da07bad5f4afaf80"/>
+    <w:bookmarkEnd w:id="127"/>
+    <w:bookmarkStart w:id="128" w:name="X529041c1036c1fbb9478ce4da07bad5f4afaf80"/>
     <w:p>
       <w:pPr>
         <w:pStyle w:val="Heading3"/>
@@ -26670,8 +26701,8 @@
         <w:t xml:space="preserve">du dashboard Next.js déployé sur Vercel. Affichage des courbes Rx(t), T(t), CR(t), RUL(t) en temps réel. Liste des alertes actives.]</w:t>
       </w:r>
     </w:p>
-    <w:bookmarkEnd w:id="125"/>
-    <w:bookmarkStart w:id="126" w:name="X1169c4bd386339b829c071b816cb256e503827c"/>
+    <w:bookmarkEnd w:id="128"/>
+    <w:bookmarkStart w:id="129" w:name="X1169c4bd386339b829c071b816cb256e503827c"/>
     <w:p>
       <w:pPr>
         <w:pStyle w:val="Heading3"/>
@@ -26750,8 +26781,8 @@
         <w:t xml:space="preserve">en mode Kanban (Ouvert / En cours / Fermé) ; (iii) détail d’un OT avec formulaire d’intervention. Démontrer la création automatique d’OT depuis une alerte rouge.]</w:t>
       </w:r>
     </w:p>
-    <w:bookmarkEnd w:id="126"/>
-    <w:bookmarkStart w:id="127" w:name="X2780e1b7d62dd546e7eb3a5805c54aa64052ce4"/>
+    <w:bookmarkEnd w:id="129"/>
+    <w:bookmarkStart w:id="130" w:name="X2780e1b7d62dd546e7eb3a5805c54aa64052ce4"/>
     <w:p>
       <w:pPr>
         <w:pStyle w:val="Heading3"/>
@@ -26772,8 +26803,8 @@
         <w:t xml:space="preserve">[À compléter — Capture d’écran de l’historique d’un asset : timeline des alertes, OT, interventions, doses d’inhibiteur injectées. Vérification de la traçabilité ISO 14224.]</w:t>
       </w:r>
     </w:p>
-    <w:bookmarkEnd w:id="127"/>
-    <w:bookmarkStart w:id="128" w:name="iii.6.5.-kpis-maintenance-calculés"/>
+    <w:bookmarkEnd w:id="130"/>
+    <w:bookmarkStart w:id="131" w:name="iii.6.5.-kpis-maintenance-calculés"/>
     <w:p>
       <w:pPr>
         <w:pStyle w:val="Heading3"/>
@@ -27166,8 +27197,8 @@
         <w:t xml:space="preserve">Discussion : ces KPIs n’ont de valeur que sur des volumes significatifs ; les valeurs présentées sont à considérer comme une démonstration de la chaîne de calcul, à confirmer en exploitation industrielle réelle.]</w:t>
       </w:r>
     </w:p>
-    <w:bookmarkEnd w:id="128"/>
-    <w:bookmarkStart w:id="129" w:name="X17affa1188989cc3f315c1c911baccad160fa52"/>
+    <w:bookmarkEnd w:id="131"/>
+    <w:bookmarkStart w:id="132" w:name="X17affa1188989cc3f315c1c911baccad160fa52"/>
     <w:p>
       <w:pPr>
         <w:pStyle w:val="Heading3"/>
@@ -27195,9 +27226,9 @@
         </w:pict>
       </w:r>
     </w:p>
-    <w:bookmarkEnd w:id="129"/>
-    <w:bookmarkEnd w:id="130"/>
-    <w:bookmarkStart w:id="136" w:name="iii.7.-discussions"/>
+    <w:bookmarkEnd w:id="132"/>
+    <w:bookmarkEnd w:id="133"/>
+    <w:bookmarkStart w:id="139" w:name="iii.7.-discussions"/>
     <w:p>
       <w:pPr>
         <w:pStyle w:val="Heading2"/>
@@ -27206,7 +27237,7 @@
         <w:t xml:space="preserve">III.7. Discussions</w:t>
       </w:r>
     </w:p>
-    <w:bookmarkStart w:id="131" w:name="Xf583610808591e0f1deaae25189be6af3381594"/>
+    <w:bookmarkStart w:id="134" w:name="Xf583610808591e0f1deaae25189be6af3381594"/>
     <w:p>
       <w:pPr>
         <w:pStyle w:val="Heading3"/>
@@ -27227,8 +27258,8 @@
         <w:t xml:space="preserve">[À compléter — Comparer la résolution effective obtenue (mΩ) aux spécifications industrielles : Cosasco CW-20, Emerson Roxar, Permasense WT. Discuter le ratio coût/performance — ratio attendu : facteur 40 à 100 moins cher pour une résolution équivalente.]</w:t>
       </w:r>
     </w:p>
-    <w:bookmarkEnd w:id="131"/>
-    <w:bookmarkStart w:id="132" w:name="X2c36353157da6d7de0b42a10a258d8e257ca42b"/>
+    <w:bookmarkEnd w:id="134"/>
+    <w:bookmarkStart w:id="135" w:name="X2c36353157da6d7de0b42a10a258d8e257ca42b"/>
     <w:p>
       <w:pPr>
         <w:pStyle w:val="Heading3"/>
@@ -27309,8 +27340,8 @@
         <w:t xml:space="preserve">Discuter les raisons d’éventuels écarts (taille du jeu de données, type de milieu multi-acide vs corrosion CO₂, protocole RTF).]</w:t>
       </w:r>
     </w:p>
-    <w:bookmarkEnd w:id="132"/>
-    <w:bookmarkStart w:id="133" w:name="X428dcc28753580dfe5a12b3f15afae834a25320"/>
+    <w:bookmarkEnd w:id="135"/>
+    <w:bookmarkStart w:id="136" w:name="X428dcc28753580dfe5a12b3f15afae834a25320"/>
     <w:p>
       <w:pPr>
         <w:pStyle w:val="Heading3"/>
@@ -27331,8 +27362,8 @@
         <w:t xml:space="preserve">[À compléter — Interpréter le temps d’adsorption détecté au regard de la cinétique d’adsorption des imidazolines (Heydari et Talebpour, 2024 ; Wang et al., 2023). Vérifier que η mesuré suit l’isotherme de Langmuir : η(C) = K_ads × C / (1 + K_ads × C).]</w:t>
       </w:r>
     </w:p>
-    <w:bookmarkEnd w:id="133"/>
-    <w:bookmarkStart w:id="134" w:name="Xec02f7cfb27a7f3fb5b1ed0a8b52c108740a54e"/>
+    <w:bookmarkEnd w:id="136"/>
+    <w:bookmarkStart w:id="137" w:name="Xec02f7cfb27a7f3fb5b1ed0a8b52c108740a54e"/>
     <w:p>
       <w:pPr>
         <w:pStyle w:val="Heading3"/>
@@ -27429,8 +27460,8 @@
         <w:t xml:space="preserve">Argumenter que le ratio coût/fonctionnalité ouvre un marché jusqu’ici inaccessible aux PME industrielles subsahariennes.]</w:t>
       </w:r>
     </w:p>
-    <w:bookmarkEnd w:id="134"/>
-    <w:bookmarkStart w:id="135" w:name="iii.7.5.-limites-du-travail"/>
+    <w:bookmarkEnd w:id="137"/>
+    <w:bookmarkStart w:id="138" w:name="iii.7.5.-limites-du-travail"/>
     <w:p>
       <w:pPr>
         <w:pStyle w:val="Heading3"/>
@@ -27576,9 +27607,9 @@
         </w:pict>
       </w:r>
     </w:p>
-    <w:bookmarkEnd w:id="135"/>
-    <w:bookmarkEnd w:id="136"/>
-    <w:bookmarkStart w:id="137" w:name="iii.8.-conclusion-du-chapitre-iii"/>
+    <w:bookmarkEnd w:id="138"/>
+    <w:bookmarkEnd w:id="139"/>
+    <w:bookmarkStart w:id="140" w:name="iii.8.-conclusion-du-chapitre-iii"/>
     <w:p>
       <w:pPr>
         <w:pStyle w:val="Heading2"/>
@@ -27629,9 +27660,9 @@
         <w:t xml:space="preserve">: (i) validation métrologi que de la sonde ER (résolution mΩ obtenue, stabilité), (ii) performance XGBoost (R², RMSE pour CR et RUL ; top-3 SHAP), (iii) diagnostic des régimes (matrice de confusion ; efficacité η mesurée de l’inhibiteur ; seuils calibrés), (iv) prototype GMAO (URL Vercel déployée ; KPIs maintenance calculés ; comparaison fonctionnelle avec GMAO industrielles). Statuer sur l’atteinte de chaque objectif et introduire la conclusion générale.]</w:t>
       </w:r>
     </w:p>
-    <w:bookmarkEnd w:id="137"/>
-    <w:bookmarkEnd w:id="138"/>
-    <w:bookmarkStart w:id="139" w:name="conclusion-générale"/>
+    <w:bookmarkEnd w:id="140"/>
+    <w:bookmarkEnd w:id="141"/>
+    <w:bookmarkStart w:id="142" w:name="conclusion-générale"/>
     <w:p>
       <w:pPr>
         <w:pStyle w:val="Heading1"/>
@@ -28360,8 +28391,8 @@
         <w:t xml:space="preserve">dans le secteur de la maintenance corrosion en Afrique subsaharienne — qu’il s’agisse d’opérateurs majeurs valorisant leurs flux de données existants ou de PME industrielles initiant leur transformation numérique sans investissement initial prohibitif.</w:t>
       </w:r>
     </w:p>
-    <w:bookmarkEnd w:id="139"/>
-    <w:bookmarkStart w:id="140" w:name="références-bibliographiques"/>
+    <w:bookmarkEnd w:id="142"/>
+    <w:bookmarkStart w:id="143" w:name="références-bibliographiques"/>
     <w:p>
       <w:pPr>
         <w:pStyle w:val="Heading1"/>
@@ -30339,8 +30370,8 @@
         <w:t xml:space="preserve">https://vercel.com/</w:t>
       </w:r>
     </w:p>
-    <w:bookmarkEnd w:id="140"/>
-    <w:bookmarkStart w:id="148" w:name="annexes"/>
+    <w:bookmarkEnd w:id="143"/>
+    <w:bookmarkStart w:id="151" w:name="annexes"/>
     <w:p>
       <w:pPr>
         <w:pStyle w:val="Heading1"/>
@@ -30349,7 +30380,7 @@
         <w:t xml:space="preserve">ANNEXES</w:t>
       </w:r>
     </w:p>
-    <w:bookmarkStart w:id="141" w:name="X4a78aeac9d5037a16008a2ee68dd1166d7aa4b4"/>
+    <w:bookmarkStart w:id="144" w:name="X4a78aeac9d5037a16008a2ee68dd1166d7aa4b4"/>
     <w:p>
       <w:pPr>
         <w:pStyle w:val="Heading2"/>
@@ -31201,8 +31232,8 @@
         <w:t xml:space="preserve">.</w:t>
       </w:r>
     </w:p>
-    <w:bookmarkEnd w:id="141"/>
-    <w:bookmarkStart w:id="142" w:name="X89fdaac54454b2f39af1c3d7cfa8452fb9c21c0"/>
+    <w:bookmarkEnd w:id="144"/>
+    <w:bookmarkStart w:id="145" w:name="X89fdaac54454b2f39af1c3d7cfa8452fb9c21c0"/>
     <w:p>
       <w:pPr>
         <w:pStyle w:val="Heading2"/>
@@ -31862,8 +31893,8 @@
         <w:t xml:space="preserve">.</w:t>
       </w:r>
     </w:p>
-    <w:bookmarkEnd w:id="142"/>
-    <w:bookmarkStart w:id="143" w:name="X866633686f9e59acae75a6fcbe6327624079636"/>
+    <w:bookmarkEnd w:id="145"/>
+    <w:bookmarkStart w:id="146" w:name="X866633686f9e59acae75a6fcbe6327624079636"/>
     <w:p>
       <w:pPr>
         <w:pStyle w:val="Heading2"/>
@@ -31884,8 +31915,8 @@
         <w:t xml:space="preserve">[Schéma à compléter]</w:t>
       </w:r>
     </w:p>
-    <w:bookmarkEnd w:id="143"/>
-    <w:bookmarkStart w:id="144" w:name="X8162eba6d3c808a71b484bf89168f5e4ba76936"/>
+    <w:bookmarkEnd w:id="146"/>
+    <w:bookmarkStart w:id="147" w:name="X8162eba6d3c808a71b484bf89168f5e4ba76936"/>
     <w:p>
       <w:pPr>
         <w:pStyle w:val="Heading2"/>
@@ -32002,8 +32033,8 @@
         <w:t xml:space="preserve">En cas de contact cutané : rincer abondamment à l’eau claire pendant au moins 15 minutes et consulter un médecin.</w:t>
       </w:r>
     </w:p>
-    <w:bookmarkEnd w:id="144"/>
-    <w:bookmarkStart w:id="145" w:name="X42bce5afd9da94b60a13eb14bc7ff64854633a7"/>
+    <w:bookmarkEnd w:id="147"/>
+    <w:bookmarkStart w:id="148" w:name="X42bce5afd9da94b60a13eb14bc7ff64854633a7"/>
     <w:p>
       <w:pPr>
         <w:pStyle w:val="Heading2"/>
@@ -32156,8 +32187,8 @@
         <w:t xml:space="preserve">: récipient hermétique, à l’abri de la chaleur.</w:t>
       </w:r>
     </w:p>
-    <w:bookmarkEnd w:id="145"/>
-    <w:bookmarkStart w:id="146" w:name="Xcc55f5e422aaf19d95dc0e373d45c068519994c"/>
+    <w:bookmarkEnd w:id="148"/>
+    <w:bookmarkStart w:id="149" w:name="Xcc55f5e422aaf19d95dc0e373d45c068519994c"/>
     <w:p>
       <w:pPr>
         <w:pStyle w:val="Heading2"/>
@@ -34124,8 +34155,8 @@
         <w:t xml:space="preserve"> asset_id;</w:t>
       </w:r>
     </w:p>
-    <w:bookmarkEnd w:id="146"/>
-    <w:bookmarkStart w:id="147" w:name="annexe-g-liste-des-fichiers-du-projet"/>
+    <w:bookmarkEnd w:id="149"/>
+    <w:bookmarkStart w:id="150" w:name="annexe-g-liste-des-fichiers-du-projet"/>
     <w:p>
       <w:pPr>
         <w:pStyle w:val="Heading2"/>
@@ -34352,9 +34383,9 @@
         <w:t xml:space="preserve">londola13/predictive-maintenance-corrosion</w:t>
       </w:r>
     </w:p>
-    <w:bookmarkEnd w:id="147"/>
-    <w:bookmarkEnd w:id="148"/>
-    <w:bookmarkStart w:id="149" w:name="table-des-matières"/>
+    <w:bookmarkEnd w:id="150"/>
+    <w:bookmarkEnd w:id="151"/>
+    <w:bookmarkStart w:id="152" w:name="table-des-matières"/>
     <w:p>
       <w:pPr>
         <w:pStyle w:val="Heading1"/>
@@ -34375,7 +34406,7 @@
         <w:t xml:space="preserve">(générée automatiquement par Word à partir des styles Heading 1 / 2 / 3)</w:t>
       </w:r>
     </w:p>
-    <w:bookmarkEnd w:id="149"/>
+    <w:bookmarkEnd w:id="152"/>
     <w:sectPr>
       <w:footnotePr>
         <w:numRestart w:val="eachSect"/>

</xml_diff>

<commit_message>
feat: 6 figures matplotlib structurelles (architecture, Wheatstone, cycle ESP32, pipeline, câblage Annexe C, ERD Annexe F)
</commit_message>
<xml_diff>
--- a/memoire/memoire_v4.docx
+++ b/memoire/memoire_v4.docx
@@ -10150,7 +10150,7 @@
     </w:p>
     <w:bookmarkEnd w:id="45"/>
     <w:bookmarkEnd w:id="46"/>
-    <w:bookmarkStart w:id="99" w:name="chapitre-ii-outils-et-méthodes"/>
+    <w:bookmarkStart w:id="108" w:name="chapitre-ii-outils-et-méthodes"/>
     <w:p>
       <w:pPr>
         <w:pStyle w:val="Heading1"/>
@@ -13298,7 +13298,7 @@
     </w:p>
     <w:bookmarkEnd w:id="59"/>
     <w:bookmarkEnd w:id="60"/>
-    <w:bookmarkStart w:id="65" w:name="Xefde6584f8f1b1bc527f3b267e24575f527761d"/>
+    <w:bookmarkStart w:id="71" w:name="Xefde6584f8f1b1bc527f3b267e24575f527761d"/>
     <w:p>
       <w:pPr>
         <w:pStyle w:val="Heading2"/>
@@ -13751,7 +13751,7 @@
       </w:r>
     </w:p>
     <w:bookmarkEnd w:id="61"/>
-    <w:bookmarkStart w:id="62" w:name="X35c6190bd1cc60e97bf9fdddcd29f071459df4b"/>
+    <w:bookmarkStart w:id="65" w:name="X35c6190bd1cc60e97bf9fdddcd29f071459df4b"/>
     <w:p>
       <w:pPr>
         <w:pStyle w:val="Heading3"/>
@@ -14131,6 +14131,61 @@
         </w:tc>
       </w:tr>
     </w:tbl>
+    <w:p>
+      <w:pPr>
+        <w:pStyle w:val="CaptionedFigure"/>
+      </w:pPr>
+      <w:r>
+        <w:drawing>
+          <wp:inline>
+            <wp:extent cx="4000500" cy="3250573"/>
+            <wp:effectExtent b="0" l="0" r="0" t="0"/>
+            <wp:docPr descr="Figure II.2 — Pont de Wheatstone instrumenté par HX711 (Rx = fil de fer immergé dans le milieu corrosif)" title="" id="63" name="Picture"/>
+            <a:graphic>
+              <a:graphicData uri="http://schemas.openxmlformats.org/drawingml/2006/picture">
+                <pic:pic>
+                  <pic:nvPicPr>
+                    <pic:cNvPr descr="figures/fig_ii2_wheatstone.png" id="64" name="Picture"/>
+                    <pic:cNvPicPr>
+                      <a:picLocks noChangeArrowheads="1" noChangeAspect="1"/>
+                    </pic:cNvPicPr>
+                  </pic:nvPicPr>
+                  <pic:blipFill>
+                    <a:blip r:embed="rId62"/>
+                    <a:stretch>
+                      <a:fillRect/>
+                    </a:stretch>
+                  </pic:blipFill>
+                  <pic:spPr bwMode="auto">
+                    <a:xfrm>
+                      <a:off x="0" y="0"/>
+                      <a:ext cx="4000500" cy="3250573"/>
+                    </a:xfrm>
+                    <a:prstGeom prst="rect">
+                      <a:avLst/>
+                    </a:prstGeom>
+                    <a:noFill/>
+                    <a:ln w="9525">
+                      <a:noFill/>
+                      <a:headEnd/>
+                      <a:tailEnd/>
+                    </a:ln>
+                  </pic:spPr>
+                </pic:pic>
+              </a:graphicData>
+            </a:graphic>
+          </wp:inline>
+        </w:drawing>
+      </w:r>
+    </w:p>
+    <w:p>
+      <w:pPr>
+        <w:pStyle w:val="ImageCaption"/>
+      </w:pPr>
+      <w:r>
+        <w:t xml:space="preserve">Figure II.2 — Pont de Wheatstone instrumenté par HX711 (Rx = fil de fer immergé dans le milieu corrosif)</w:t>
+      </w:r>
+    </w:p>
     <w:p>
       <w:pPr>
         <w:pStyle w:val="BodyText"/>
@@ -14662,8 +14717,8 @@
         </m:oMath>
       </m:oMathPara>
     </w:p>
-    <w:bookmarkEnd w:id="62"/>
-    <w:bookmarkStart w:id="63" w:name="Xb1678c44d9c1c974a4fc32ac4a0d35b21e8d3e3"/>
+    <w:bookmarkEnd w:id="65"/>
+    <w:bookmarkStart w:id="66" w:name="Xb1678c44d9c1c974a4fc32ac4a0d35b21e8d3e3"/>
     <w:p>
       <w:pPr>
         <w:pStyle w:val="Heading3"/>
@@ -15343,8 +15398,8 @@
         </m:oMath>
       </m:oMathPara>
     </w:p>
-    <w:bookmarkEnd w:id="63"/>
-    <w:bookmarkStart w:id="64" w:name="Xbb16ac8524b73be8ea1078b499461bed8d4a0c5"/>
+    <w:bookmarkEnd w:id="66"/>
+    <w:bookmarkStart w:id="70" w:name="Xbb16ac8524b73be8ea1078b499461bed8d4a0c5"/>
     <w:p>
       <w:pPr>
         <w:pStyle w:val="Heading3"/>
@@ -15626,7 +15681,62 @@
     </w:p>
     <w:p>
       <w:pPr>
-        <w:pStyle w:val="FirstParagraph"/>
+        <w:pStyle w:val="CaptionedFigure"/>
+      </w:pPr>
+      <w:r>
+        <w:drawing>
+          <wp:inline>
+            <wp:extent cx="5067300" cy="2288270"/>
+            <wp:effectExtent b="0" l="0" r="0" t="0"/>
+            <wp:docPr descr="Figure II.3 — Cycle de fonctionnement ESP32 en deep sleep pulsé" title="" id="68" name="Picture"/>
+            <a:graphic>
+              <a:graphicData uri="http://schemas.openxmlformats.org/drawingml/2006/picture">
+                <pic:pic>
+                  <pic:nvPicPr>
+                    <pic:cNvPr descr="figures/fig_ii3_cycle_esp32.png" id="69" name="Picture"/>
+                    <pic:cNvPicPr>
+                      <a:picLocks noChangeArrowheads="1" noChangeAspect="1"/>
+                    </pic:cNvPicPr>
+                  </pic:nvPicPr>
+                  <pic:blipFill>
+                    <a:blip r:embed="rId67"/>
+                    <a:stretch>
+                      <a:fillRect/>
+                    </a:stretch>
+                  </pic:blipFill>
+                  <pic:spPr bwMode="auto">
+                    <a:xfrm>
+                      <a:off x="0" y="0"/>
+                      <a:ext cx="5067300" cy="2288270"/>
+                    </a:xfrm>
+                    <a:prstGeom prst="rect">
+                      <a:avLst/>
+                    </a:prstGeom>
+                    <a:noFill/>
+                    <a:ln w="9525">
+                      <a:noFill/>
+                      <a:headEnd/>
+                      <a:tailEnd/>
+                    </a:ln>
+                  </pic:spPr>
+                </pic:pic>
+              </a:graphicData>
+            </a:graphic>
+          </wp:inline>
+        </w:drawing>
+      </w:r>
+    </w:p>
+    <w:p>
+      <w:pPr>
+        <w:pStyle w:val="ImageCaption"/>
+      </w:pPr>
+      <w:r>
+        <w:t xml:space="preserve">Figure II.3 — Cycle de fonctionnement ESP32 en deep sleep pulsé</w:t>
+      </w:r>
+    </w:p>
+    <w:p>
+      <w:pPr>
+        <w:pStyle w:val="BodyText"/>
       </w:pPr>
       <w:r>
         <w:t xml:space="preserve">La</w:t>
@@ -16000,9 +16110,9 @@
         </w:pict>
       </w:r>
     </w:p>
-    <w:bookmarkEnd w:id="64"/>
-    <w:bookmarkEnd w:id="65"/>
-    <w:bookmarkStart w:id="69" w:name="ii.3.-matériels-mobilisés"/>
+    <w:bookmarkEnd w:id="70"/>
+    <w:bookmarkEnd w:id="71"/>
+    <w:bookmarkStart w:id="75" w:name="ii.3.-matériels-mobilisés"/>
     <w:p>
       <w:pPr>
         <w:pStyle w:val="Heading2"/>
@@ -16011,7 +16121,7 @@
         <w:t xml:space="preserve">II.3. Matériels mobilisés</w:t>
       </w:r>
     </w:p>
-    <w:bookmarkStart w:id="66" w:name="ii.3.1.-matériels-expérimentaux"/>
+    <w:bookmarkStart w:id="72" w:name="ii.3.1.-matériels-expérimentaux"/>
     <w:p>
       <w:pPr>
         <w:pStyle w:val="Heading3"/>
@@ -16922,8 +17032,8 @@
         </w:tc>
       </w:tr>
     </w:tbl>
-    <w:bookmarkEnd w:id="66"/>
-    <w:bookmarkStart w:id="67" w:name="ii.3.2.-ressources-logicielles"/>
+    <w:bookmarkEnd w:id="72"/>
+    <w:bookmarkStart w:id="73" w:name="ii.3.2.-ressources-logicielles"/>
     <w:p>
       <w:pPr>
         <w:pStyle w:val="Heading3"/>
@@ -17449,8 +17559,8 @@
         </w:tc>
       </w:tr>
     </w:tbl>
-    <w:bookmarkEnd w:id="67"/>
-    <w:bookmarkStart w:id="68" w:name="ii.3.3.-ressources-documentaires"/>
+    <w:bookmarkEnd w:id="73"/>
+    <w:bookmarkStart w:id="74" w:name="ii.3.3.-ressources-documentaires"/>
     <w:p>
       <w:pPr>
         <w:pStyle w:val="Heading3"/>
@@ -17983,9 +18093,9 @@
         </w:pict>
       </w:r>
     </w:p>
-    <w:bookmarkEnd w:id="68"/>
-    <w:bookmarkEnd w:id="69"/>
-    <w:bookmarkStart w:id="75" w:name="X8236413271ac5e519391d9aebf8ceff17de3c22"/>
+    <w:bookmarkEnd w:id="74"/>
+    <w:bookmarkEnd w:id="75"/>
+    <w:bookmarkStart w:id="84" w:name="X8236413271ac5e519391d9aebf8ceff17de3c22"/>
     <w:p>
       <w:pPr>
         <w:pStyle w:val="Heading2"/>
@@ -18014,7 +18124,62 @@
         <w:t xml:space="preserve">.</w:t>
       </w:r>
     </w:p>
-    <w:bookmarkStart w:id="70" w:name="ii.4.1.-acquisition"/>
+    <w:p>
+      <w:pPr>
+        <w:pStyle w:val="CaptionedFigure"/>
+      </w:pPr>
+      <w:r>
+        <w:drawing>
+          <wp:inline>
+            <wp:extent cx="5067300" cy="1841070"/>
+            <wp:effectExtent b="0" l="0" r="0" t="0"/>
+            <wp:docPr descr="Figure II.4 — Pipeline Python de traitement des données (5 étapes)" title="" id="77" name="Picture"/>
+            <a:graphic>
+              <a:graphicData uri="http://schemas.openxmlformats.org/drawingml/2006/picture">
+                <pic:pic>
+                  <pic:nvPicPr>
+                    <pic:cNvPr descr="figures/fig_ii4_pipeline.png" id="78" name="Picture"/>
+                    <pic:cNvPicPr>
+                      <a:picLocks noChangeArrowheads="1" noChangeAspect="1"/>
+                    </pic:cNvPicPr>
+                  </pic:nvPicPr>
+                  <pic:blipFill>
+                    <a:blip r:embed="rId76"/>
+                    <a:stretch>
+                      <a:fillRect/>
+                    </a:stretch>
+                  </pic:blipFill>
+                  <pic:spPr bwMode="auto">
+                    <a:xfrm>
+                      <a:off x="0" y="0"/>
+                      <a:ext cx="5067300" cy="1841070"/>
+                    </a:xfrm>
+                    <a:prstGeom prst="rect">
+                      <a:avLst/>
+                    </a:prstGeom>
+                    <a:noFill/>
+                    <a:ln w="9525">
+                      <a:noFill/>
+                      <a:headEnd/>
+                      <a:tailEnd/>
+                    </a:ln>
+                  </pic:spPr>
+                </pic:pic>
+              </a:graphicData>
+            </a:graphic>
+          </wp:inline>
+        </w:drawing>
+      </w:r>
+    </w:p>
+    <w:p>
+      <w:pPr>
+        <w:pStyle w:val="ImageCaption"/>
+      </w:pPr>
+      <w:r>
+        <w:t xml:space="preserve">Figure II.4 — Pipeline Python de traitement des données (5 étapes)</w:t>
+      </w:r>
+    </w:p>
+    <w:bookmarkStart w:id="79" w:name="ii.4.1.-acquisition"/>
     <w:p>
       <w:pPr>
         <w:pStyle w:val="Heading3"/>
@@ -18154,8 +18319,8 @@
         <w:t xml:space="preserve">Une mesure est émise toutes les 600 secondes (10 minutes). Pour un run de 48 heures, cela représente 288 points de mesure ; pour un run de 72 heures, 432 points. L’historique complet est ainsi centralisé sur Supabase et accessible aussi bien à l’application Streamlit qu’aux notebooks d’analyse, sans manipulation manuelle de fichiers.</w:t>
       </w:r>
     </w:p>
-    <w:bookmarkEnd w:id="70"/>
-    <w:bookmarkStart w:id="71" w:name="ii.4.2.-nettoyage-du-signal"/>
+    <w:bookmarkEnd w:id="79"/>
+    <w:bookmarkStart w:id="80" w:name="ii.4.2.-nettoyage-du-signal"/>
     <w:p>
       <w:pPr>
         <w:pStyle w:val="Heading3"/>
@@ -18221,8 +18386,8 @@
         <w:t xml:space="preserve">.</w:t>
       </w:r>
     </w:p>
-    <w:bookmarkEnd w:id="71"/>
-    <w:bookmarkStart w:id="72" w:name="ii.4.3.-compensation-thermique"/>
+    <w:bookmarkEnd w:id="80"/>
+    <w:bookmarkStart w:id="81" w:name="ii.4.3.-compensation-thermique"/>
     <w:p>
       <w:pPr>
         <w:pStyle w:val="Heading3"/>
@@ -18641,8 +18806,8 @@
         <w:t xml:space="preserve">_corr(t) ne dépend plus que de la corrosion, pas de la température ambiante.</w:t>
       </w:r>
     </w:p>
-    <w:bookmarkEnd w:id="72"/>
-    <w:bookmarkStart w:id="73" w:name="ii.4.4.-feature-engineering"/>
+    <w:bookmarkEnd w:id="81"/>
+    <w:bookmarkStart w:id="82" w:name="ii.4.4.-feature-engineering"/>
     <w:p>
       <w:pPr>
         <w:pStyle w:val="Heading3"/>
@@ -19301,8 +19466,8 @@
         <w:t xml:space="preserve">(heures) : durée de vie résiduelle.</w:t>
       </w:r>
     </w:p>
-    <w:bookmarkEnd w:id="73"/>
-    <w:bookmarkStart w:id="74" w:name="ii.4.5.-calcul-du-rul"/>
+    <w:bookmarkEnd w:id="82"/>
+    <w:bookmarkStart w:id="83" w:name="ii.4.5.-calcul-du-rul"/>
     <w:p>
       <w:pPr>
         <w:pStyle w:val="Heading3"/>
@@ -19611,9 +19776,9 @@
         </w:pict>
       </w:r>
     </w:p>
-    <w:bookmarkEnd w:id="74"/>
-    <w:bookmarkEnd w:id="75"/>
-    <w:bookmarkStart w:id="81" w:name="Xa8014f60c555bd98b3c58e7b198d9c87054b6ca"/>
+    <w:bookmarkEnd w:id="83"/>
+    <w:bookmarkEnd w:id="84"/>
+    <w:bookmarkStart w:id="90" w:name="Xa8014f60c555bd98b3c58e7b198d9c87054b6ca"/>
     <w:p>
       <w:pPr>
         <w:pStyle w:val="Heading2"/>
@@ -19622,7 +19787,7 @@
         <w:t xml:space="preserve">II.5. Méthodologie d’entraînement du modèle XGBoost</w:t>
       </w:r>
     </w:p>
-    <w:bookmarkStart w:id="76" w:name="X77ced7e9d825a21d0cd2d89923184799ce997b4"/>
+    <w:bookmarkStart w:id="85" w:name="X77ced7e9d825a21d0cd2d89923184799ce997b4"/>
     <w:p>
       <w:pPr>
         <w:pStyle w:val="Heading3"/>
@@ -19670,8 +19835,8 @@
         <w:t xml:space="preserve">: chaque fold entraîne sur les données passées et teste sur les données futures, jamais l’inverse (Bergmeir et Benítez, 2012). Ce protocole évite toute fuite temporelle et fournit une estimation honnête de la performance en conditions de déploiement.</w:t>
       </w:r>
     </w:p>
-    <w:bookmarkEnd w:id="76"/>
-    <w:bookmarkStart w:id="77" w:name="ii.5.2.-hyperparamètres-xgboost"/>
+    <w:bookmarkEnd w:id="85"/>
+    <w:bookmarkStart w:id="86" w:name="ii.5.2.-hyperparamètres-xgboost"/>
     <w:p>
       <w:pPr>
         <w:pStyle w:val="Heading3"/>
@@ -20069,8 +20234,8 @@
         <w:t xml:space="preserve">Source : Chen et Guestrin (2016) ; XGBoost (2024).</w:t>
       </w:r>
     </w:p>
-    <w:bookmarkEnd w:id="77"/>
-    <w:bookmarkStart w:id="78" w:name="ii.5.3.-métriques-dévaluation"/>
+    <w:bookmarkEnd w:id="86"/>
+    <w:bookmarkStart w:id="87" w:name="ii.5.3.-métriques-dévaluation"/>
     <w:p>
       <w:pPr>
         <w:pStyle w:val="Heading3"/>
@@ -20586,8 +20751,8 @@
         <w:t xml:space="preserve">(prédiction = moyenne du training set) sert de comparaison pour vérifier que le modèle apporte effectivement une valeur ajoutée.</w:t>
       </w:r>
     </w:p>
-    <w:bookmarkEnd w:id="78"/>
-    <w:bookmarkStart w:id="79" w:name="ii.5.4.-interprétabilité-par-shap"/>
+    <w:bookmarkEnd w:id="87"/>
+    <w:bookmarkStart w:id="88" w:name="ii.5.4.-interprétabilité-par-shap"/>
     <w:p>
       <w:pPr>
         <w:pStyle w:val="Heading3"/>
@@ -20710,8 +20875,8 @@
         <w:t xml:space="preserve">et de vérifier la cohérence avec la physique du phénomène.</w:t>
       </w:r>
     </w:p>
-    <w:bookmarkEnd w:id="79"/>
-    <w:bookmarkStart w:id="80" w:name="Xa84e41cc3fff3ce0d5a7c2fab658d87d03b5676"/>
+    <w:bookmarkEnd w:id="88"/>
+    <w:bookmarkStart w:id="89" w:name="Xa84e41cc3fff3ce0d5a7c2fab658d87d03b5676"/>
     <w:p>
       <w:pPr>
         <w:pStyle w:val="Heading3"/>
@@ -21096,9 +21261,9 @@
         </w:pict>
       </w:r>
     </w:p>
-    <w:bookmarkEnd w:id="80"/>
-    <w:bookmarkEnd w:id="81"/>
-    <w:bookmarkStart w:id="86" w:name="X8f2c3d1b22491317b619a97563f1a03b47db684"/>
+    <w:bookmarkEnd w:id="89"/>
+    <w:bookmarkEnd w:id="90"/>
+    <w:bookmarkStart w:id="95" w:name="X8f2c3d1b22491317b619a97563f1a03b47db684"/>
     <w:p>
       <w:pPr>
         <w:pStyle w:val="Heading2"/>
@@ -21107,7 +21272,7 @@
         <w:t xml:space="preserve">II.6. Protocole expérimental run-to-failure</w:t>
       </w:r>
     </w:p>
-    <w:bookmarkStart w:id="82" w:name="ii.6.1.-justification-du-protocole-rtf"/>
+    <w:bookmarkStart w:id="91" w:name="ii.6.1.-justification-du-protocole-rtf"/>
     <w:p>
       <w:pPr>
         <w:pStyle w:val="Heading3"/>
@@ -21172,8 +21337,8 @@
         <w:t xml:space="preserve">(avec événement de défaillance observé) pour l’apprentissage de la prédiction RUL.</w:t>
       </w:r>
     </w:p>
-    <w:bookmarkEnd w:id="82"/>
-    <w:bookmarkStart w:id="83" w:name="ii.6.2.-plan-expérimental"/>
+    <w:bookmarkEnd w:id="91"/>
+    <w:bookmarkStart w:id="92" w:name="ii.6.2.-plan-expérimental"/>
     <w:p>
       <w:pPr>
         <w:pStyle w:val="Heading3"/>
@@ -21441,8 +21606,8 @@
         </w:tc>
       </w:tr>
     </w:tbl>
-    <w:bookmarkEnd w:id="83"/>
-    <w:bookmarkStart w:id="84" w:name="ii.6.3.-procédure-standard-par-run"/>
+    <w:bookmarkEnd w:id="92"/>
+    <w:bookmarkStart w:id="93" w:name="ii.6.3.-procédure-standard-par-run"/>
     <w:p>
       <w:pPr>
         <w:pStyle w:val="Heading3"/>
@@ -21650,8 +21815,8 @@
         <w:t xml:space="preserve">: photographie de la cellule et du fil corrodé, nettoyage et préparation du run suivant.</w:t>
       </w:r>
     </w:p>
-    <w:bookmarkEnd w:id="84"/>
-    <w:bookmarkStart w:id="85" w:name="X309710c3ccd4f2036252b00d8ea2cb5ed344262"/>
+    <w:bookmarkEnd w:id="93"/>
+    <w:bookmarkStart w:id="94" w:name="X309710c3ccd4f2036252b00d8ea2cb5ed344262"/>
     <w:p>
       <w:pPr>
         <w:pStyle w:val="Heading3"/>
@@ -21919,9 +22084,9 @@
         </w:pict>
       </w:r>
     </w:p>
-    <w:bookmarkEnd w:id="85"/>
-    <w:bookmarkEnd w:id="86"/>
-    <w:bookmarkStart w:id="96" w:name="X358e7e995ad73683a6412031f4f03c34e5efee7"/>
+    <w:bookmarkEnd w:id="94"/>
+    <w:bookmarkEnd w:id="95"/>
+    <w:bookmarkStart w:id="105" w:name="X358e7e995ad73683a6412031f4f03c34e5efee7"/>
     <w:p>
       <w:pPr>
         <w:pStyle w:val="Heading2"/>
@@ -21930,7 +22095,7 @@
         <w:t xml:space="preserve">II.7. Architecture d’intégration au CMMS open-source par API REST (OS4)</w:t>
       </w:r>
     </w:p>
-    <w:bookmarkStart w:id="87" w:name="Xe49dc64037f9edcd58a9084f4edb98caa6e231e"/>
+    <w:bookmarkStart w:id="96" w:name="Xe49dc64037f9edcd58a9084f4edb98caa6e231e"/>
     <w:p>
       <w:pPr>
         <w:pStyle w:val="Heading3"/>
@@ -22177,8 +22342,8 @@
         <w:t xml:space="preserve">: un CMMS auto-hébergeable (on-premise) est compatible avec les contraintes de sécurité industrielle (réseau OT isolé, pas de cloud public) — ce qui n’est pas le cas de Supabase + Vercel.</w:t>
       </w:r>
     </w:p>
-    <w:bookmarkEnd w:id="87"/>
-    <w:bookmarkStart w:id="88" w:name="X873e9712944516e59d3f156fb9139b734617e3b"/>
+    <w:bookmarkEnd w:id="96"/>
+    <w:bookmarkStart w:id="97" w:name="X873e9712944516e59d3f156fb9139b734617e3b"/>
     <w:p>
       <w:pPr>
         <w:pStyle w:val="Heading3"/>
@@ -22727,8 +22892,8 @@
         <w:t xml:space="preserve">— meilleure couverture fonctionnelle, API REST native documentée, communauté francophone active, déployable on-premise.</w:t>
       </w:r>
     </w:p>
-    <w:bookmarkEnd w:id="88"/>
-    <w:bookmarkStart w:id="89" w:name="X0a8739849a0b901515e810b8ddb928a83aa71ab"/>
+    <w:bookmarkEnd w:id="97"/>
+    <w:bookmarkStart w:id="98" w:name="X0a8739849a0b901515e810b8ddb928a83aa71ab"/>
     <w:p>
       <w:pPr>
         <w:pStyle w:val="Heading3"/>
@@ -23220,8 +23385,8 @@
         <w:t xml:space="preserve">Sources : Streamlit (2024) ; GLPI Project (2024) ; XGBoost Documentation (Chen et Guestrin, 2016).</w:t>
       </w:r>
     </w:p>
-    <w:bookmarkEnd w:id="89"/>
-    <w:bookmarkStart w:id="93" w:name="X3074847b1602fc8740aedbd5f3227b4dd48acd3"/>
+    <w:bookmarkEnd w:id="98"/>
+    <w:bookmarkStart w:id="102" w:name="X3074847b1602fc8740aedbd5f3227b4dd48acd3"/>
     <w:p>
       <w:pPr>
         <w:pStyle w:val="Heading3"/>
@@ -23237,20 +23402,20 @@
       <w:r>
         <w:drawing>
           <wp:inline>
-            <wp:extent cx="4267200" cy="5224261"/>
+            <wp:extent cx="4267200" cy="5475347"/>
             <wp:effectExtent b="0" l="0" r="0" t="0"/>
-            <wp:docPr descr="Figure II.1 — Architecture de la boucle intégrée Sonde ER → Supabase → Streamlit → CMMS open-source" title="" id="91" name="Picture"/>
+            <wp:docPr descr="Figure II.1 — Architecture de la boucle intégrée Sonde ER → Supabase → Streamlit → CMMS open-source" title="" id="100" name="Picture"/>
             <a:graphic>
               <a:graphicData uri="http://schemas.openxmlformats.org/drawingml/2006/picture">
                 <pic:pic>
                   <pic:nvPicPr>
-                    <pic:cNvPr descr="figures/fig_ii1_architecture.png" id="92" name="Picture"/>
+                    <pic:cNvPr descr="figures/fig_ii1_architecture.png" id="101" name="Picture"/>
                     <pic:cNvPicPr>
                       <a:picLocks noChangeArrowheads="1" noChangeAspect="1"/>
                     </pic:cNvPicPr>
                   </pic:nvPicPr>
                   <pic:blipFill>
-                    <a:blip r:embed="rId90"/>
+                    <a:blip r:embed="rId99"/>
                     <a:stretch>
                       <a:fillRect/>
                     </a:stretch>
@@ -23258,7 +23423,7 @@
                   <pic:spPr bwMode="auto">
                     <a:xfrm>
                       <a:off x="0" y="0"/>
-                      <a:ext cx="4267200" cy="5224261"/>
+                      <a:ext cx="4267200" cy="5475347"/>
                     </a:xfrm>
                     <a:prstGeom prst="rect">
                       <a:avLst/>
@@ -23285,8 +23450,8 @@
         <w:t xml:space="preserve">Figure II.1 — Architecture de la boucle intégrée Sonde ER → Supabase → Streamlit → CMMS open-source</w:t>
       </w:r>
     </w:p>
-    <w:bookmarkEnd w:id="93"/>
-    <w:bookmarkStart w:id="94" w:name="X7b4697db37a967a1cc93fab82402694227ed967"/>
+    <w:bookmarkEnd w:id="102"/>
+    <w:bookmarkStart w:id="103" w:name="X7b4697db37a967a1cc93fab82402694227ed967"/>
     <w:p>
       <w:pPr>
         <w:pStyle w:val="Heading3"/>
@@ -24061,8 +24226,8 @@
         <w:t xml:space="preserve">ticket)</w:t>
       </w:r>
     </w:p>
-    <w:bookmarkEnd w:id="94"/>
-    <w:bookmarkStart w:id="95" w:name="X6daa42d570212a4ddf8cec02ed6ecb7bd6e7228"/>
+    <w:bookmarkEnd w:id="103"/>
+    <w:bookmarkStart w:id="104" w:name="X6daa42d570212a4ddf8cec02ed6ecb7bd6e7228"/>
     <w:p>
       <w:pPr>
         <w:pStyle w:val="Heading3"/>
@@ -24545,9 +24710,9 @@
         </w:pict>
       </w:r>
     </w:p>
-    <w:bookmarkEnd w:id="95"/>
-    <w:bookmarkEnd w:id="96"/>
-    <w:bookmarkStart w:id="97" w:name="X0fcd5b5066ea3b0aa0fe0eb42347356d14c3aaf"/>
+    <w:bookmarkEnd w:id="104"/>
+    <w:bookmarkEnd w:id="105"/>
+    <w:bookmarkStart w:id="106" w:name="X0fcd5b5066ea3b0aa0fe0eb42347356d14c3aaf"/>
     <w:p>
       <w:pPr>
         <w:pStyle w:val="Heading2"/>
@@ -25019,8 +25184,8 @@
         </w:pict>
       </w:r>
     </w:p>
-    <w:bookmarkEnd w:id="97"/>
-    <w:bookmarkStart w:id="98" w:name="ii.9.-conclusion-du-chapitre-ii"/>
+    <w:bookmarkEnd w:id="106"/>
+    <w:bookmarkStart w:id="107" w:name="ii.9.-conclusion-du-chapitre-ii"/>
     <w:p>
       <w:pPr>
         <w:pStyle w:val="Heading2"/>
@@ -25114,9 +25279,9 @@
         <w:t xml:space="preserve">présente à présent les résultats issus de la mise en œuvre de cette méthodologie, leur analyse et leur discussion.</w:t>
       </w:r>
     </w:p>
-    <w:bookmarkEnd w:id="98"/>
-    <w:bookmarkEnd w:id="99"/>
-    <w:bookmarkStart w:id="141" w:name="chapitre-iii-résultats-et-discussions"/>
+    <w:bookmarkEnd w:id="107"/>
+    <w:bookmarkEnd w:id="108"/>
+    <w:bookmarkStart w:id="150" w:name="chapitre-iii-résultats-et-discussions"/>
     <w:p>
       <w:pPr>
         <w:pStyle w:val="Heading1"/>
@@ -25252,7 +25417,7 @@
         </w:pict>
       </w:r>
     </w:p>
-    <w:bookmarkStart w:id="100" w:name="iii.0.-introduction"/>
+    <w:bookmarkStart w:id="109" w:name="iii.0.-introduction"/>
     <w:p>
       <w:pPr>
         <w:pStyle w:val="Heading2"/>
@@ -25310,8 +25475,8 @@
         </w:pict>
       </w:r>
     </w:p>
-    <w:bookmarkEnd w:id="100"/>
-    <w:bookmarkStart w:id="105" w:name="X39f727902a9cb6c8b752dcc901c68810ace20c1"/>
+    <w:bookmarkEnd w:id="109"/>
+    <w:bookmarkStart w:id="114" w:name="X39f727902a9cb6c8b752dcc901c68810ace20c1"/>
     <w:p>
       <w:pPr>
         <w:pStyle w:val="Heading2"/>
@@ -25320,7 +25485,7 @@
         <w:t xml:space="preserve">III.1. Validation métrologi que de la sonde ER (OS1)</w:t>
       </w:r>
     </w:p>
-    <w:bookmarkStart w:id="101" w:name="Xfbd2fff90ecadeede27324a11c87b55596e05af"/>
+    <w:bookmarkStart w:id="110" w:name="Xfbd2fff90ecadeede27324a11c87b55596e05af"/>
     <w:p>
       <w:pPr>
         <w:pStyle w:val="Heading3"/>
@@ -25341,8 +25506,8 @@
         <w:t xml:space="preserve">[À compléter — Protocole : immersion du fil dans de l’eau distillée pendant 24 h, mesure de Rx(t). Insérer : graphe Rx(t) sur 24 h, calcul de l’écart-type σ_Rx (mΩ), vérification que σ_Rx &lt; 0,01 mΩ.]</w:t>
       </w:r>
     </w:p>
-    <w:bookmarkEnd w:id="101"/>
-    <w:bookmarkStart w:id="102" w:name="X9798bcadc97144aaf05180f3aab863ab053a2c1"/>
+    <w:bookmarkEnd w:id="110"/>
+    <w:bookmarkStart w:id="111" w:name="X9798bcadc97144aaf05180f3aab863ab053a2c1"/>
     <w:p>
       <w:pPr>
         <w:pStyle w:val="Heading3"/>
@@ -25363,8 +25528,8 @@
         <w:t xml:space="preserve">[À compléter — Protocole : substitution du fil par 5 résistances de précision (0,1 Ω, 0,2 Ω, 0,5 Ω, 1,0 Ω, 2,0 Ω). Insérer : tableau comparatif HX711 vs valeur étalon, graphe linéarité, calcul de l’erreur relative moyenne (%).]</w:t>
       </w:r>
     </w:p>
-    <w:bookmarkEnd w:id="102"/>
-    <w:bookmarkStart w:id="103" w:name="Xf3f9dca319410a6ac55cc577b8ca02fdf33596c"/>
+    <w:bookmarkEnd w:id="111"/>
+    <w:bookmarkStart w:id="112" w:name="Xf3f9dca319410a6ac55cc577b8ca02fdf33596c"/>
     <w:p>
       <w:pPr>
         <w:pStyle w:val="Heading3"/>
@@ -25385,8 +25550,8 @@
         <w:t xml:space="preserve">[À compléter — Protocole : variation contrôlée de la température de 22 °C à 32 °C, mesure simultanée Rx_brut et Rx_corr. Insérer : courbe Rx_brut(T) et Rx_corr(T) — démontrer que la pente Rx_corr(T) est &lt; 1 % de la pente Rx_brut(T).]</w:t>
       </w:r>
     </w:p>
-    <w:bookmarkEnd w:id="103"/>
-    <w:bookmarkStart w:id="104" w:name="Xc61a47e6fb031cca5d5ed31958ac0d55c70bb9c"/>
+    <w:bookmarkEnd w:id="112"/>
+    <w:bookmarkStart w:id="113" w:name="Xc61a47e6fb031cca5d5ed31958ac0d55c70bb9c"/>
     <w:p>
       <w:pPr>
         <w:pStyle w:val="Heading3"/>
@@ -25414,9 +25579,9 @@
         </w:pict>
       </w:r>
     </w:p>
-    <w:bookmarkEnd w:id="104"/>
-    <w:bookmarkEnd w:id="105"/>
-    <w:bookmarkStart w:id="111" w:name="X0bce19cb0866722ea309888a58a01622b4d7900"/>
+    <w:bookmarkEnd w:id="113"/>
+    <w:bookmarkEnd w:id="114"/>
+    <w:bookmarkStart w:id="120" w:name="X0bce19cb0866722ea309888a58a01622b4d7900"/>
     <w:p>
       <w:pPr>
         <w:pStyle w:val="Heading2"/>
@@ -25425,7 +25590,7 @@
         <w:t xml:space="preserve">III.2. Résultats des quatre runs run-to-failure (OS2)</w:t>
       </w:r>
     </w:p>
-    <w:bookmarkStart w:id="106" w:name="X3b3d9eba5f9981291fe0ec98b42271b1e9d2268"/>
+    <w:bookmarkStart w:id="115" w:name="X3b3d9eba5f9981291fe0ec98b42271b1e9d2268"/>
     <w:p>
       <w:pPr>
         <w:pStyle w:val="Heading3"/>
@@ -25446,8 +25611,8 @@
         <w:t xml:space="preserve">[À compléter — Insérer : (i) graphe Rx(t) sur la durée du run, (ii) graphe CR_lisse(t), (iii) graphe T(t). Indicateurs : durée totale du run (h), Rx initial (Ω), Rx à la rupture (Ω), CR moyen (mm/an), CR maximum (mm/an), photographie du fil après rupture.]</w:t>
       </w:r>
     </w:p>
-    <w:bookmarkEnd w:id="106"/>
-    <w:bookmarkStart w:id="107" w:name="Xede53b9c140fb1eff8d500bb1b1dba20d8f1cad"/>
+    <w:bookmarkEnd w:id="115"/>
+    <w:bookmarkStart w:id="116" w:name="Xede53b9c140fb1eff8d500bb1b1dba20d8f1cad"/>
     <w:p>
       <w:pPr>
         <w:pStyle w:val="Heading3"/>
@@ -25468,8 +25633,8 @@
         <w:t xml:space="preserve">[À compléter — Idem Run 1. Tableau comparatif Run 1 vs Run 2 : durée, CR moyen, CR max, Rx_rupture. Discussion de la reproductibilité.]</w:t>
       </w:r>
     </w:p>
-    <w:bookmarkEnd w:id="107"/>
-    <w:bookmarkStart w:id="108" w:name="Xae545383e689d4c0657cf2f5391fc242d7a9423"/>
+    <w:bookmarkEnd w:id="116"/>
+    <w:bookmarkStart w:id="117" w:name="Xae545383e689d4c0657cf2f5391fc242d7a9423"/>
     <w:p>
       <w:pPr>
         <w:pStyle w:val="Heading3"/>
@@ -25490,8 +25655,8 @@
         <w:t xml:space="preserve">[À compléter — Insérer : graphe Rx(t) avec annotation du temps d’injection de l’inhibiteur (t_injection) et du temps d’adsorption détecté (t_adsorption). Calcul de Δt_adsorption = t_adsorption - t_injection. Calcul de l’efficacité d’inhibition η₁ = (CR_avant - CR_après) / CR_avant × 100.]</w:t>
       </w:r>
     </w:p>
-    <w:bookmarkEnd w:id="108"/>
-    <w:bookmarkStart w:id="109" w:name="Xd48910367acf00fc42b0d520ef39f968f60675b"/>
+    <w:bookmarkEnd w:id="117"/>
+    <w:bookmarkStart w:id="118" w:name="Xd48910367acf00fc42b0d520ef39f968f60675b"/>
     <w:p>
       <w:pPr>
         <w:pStyle w:val="Heading3"/>
@@ -25512,8 +25677,8 @@
         <w:t xml:space="preserve">[À compléter — Idem Run 3. Calcul η₂. Comparaison η₁ vs η₂. Vérification de la relation dose-efficacité (loi de Langmuir attendue).]</w:t>
       </w:r>
     </w:p>
-    <w:bookmarkEnd w:id="109"/>
-    <w:bookmarkStart w:id="110" w:name="iii.2.5.-synthèse-des-quatre-runs"/>
+    <w:bookmarkEnd w:id="118"/>
+    <w:bookmarkStart w:id="119" w:name="iii.2.5.-synthèse-des-quatre-runs"/>
     <w:p>
       <w:pPr>
         <w:pStyle w:val="Heading3"/>
@@ -25541,9 +25706,9 @@
         </w:pict>
       </w:r>
     </w:p>
-    <w:bookmarkEnd w:id="110"/>
-    <w:bookmarkEnd w:id="111"/>
-    <w:bookmarkStart w:id="115" w:name="iii.3.-performance-du-modèle-xgboost-os2"/>
+    <w:bookmarkEnd w:id="119"/>
+    <w:bookmarkEnd w:id="120"/>
+    <w:bookmarkStart w:id="124" w:name="iii.3.-performance-du-modèle-xgboost-os2"/>
     <w:p>
       <w:pPr>
         <w:pStyle w:val="Heading2"/>
@@ -25552,7 +25717,7 @@
         <w:t xml:space="preserve">III.3. Performance du modèle XGBoost (OS2)</w:t>
       </w:r>
     </w:p>
-    <w:bookmarkStart w:id="112" w:name="X3b01179fbe63babff5ba25a4654c56ce257327e"/>
+    <w:bookmarkStart w:id="121" w:name="X3b01179fbe63babff5ba25a4654c56ce257327e"/>
     <w:p>
       <w:pPr>
         <w:pStyle w:val="Heading3"/>
@@ -26169,8 +26334,8 @@
         <w:t xml:space="preserve">[Même structure pour RUL.]</w:t>
       </w:r>
     </w:p>
-    <w:bookmarkEnd w:id="112"/>
-    <w:bookmarkStart w:id="113" w:name="iii.3.2.-courbes-prédites-vs-observées"/>
+    <w:bookmarkEnd w:id="121"/>
+    <w:bookmarkStart w:id="122" w:name="iii.3.2.-courbes-prédites-vs-observées"/>
     <w:p>
       <w:pPr>
         <w:pStyle w:val="Heading3"/>
@@ -26191,8 +26356,8 @@
         <w:t xml:space="preserve">[À compléter — Graphes scatter plot CR_prédit vs CR_observé et RUL_prédit vs RUL_observé, avec diagonale idéale et bandes ±15 %.]</w:t>
       </w:r>
     </w:p>
-    <w:bookmarkEnd w:id="113"/>
-    <w:bookmarkStart w:id="114" w:name="X2159342e28147cb832fdb7750aa47e2f35fe05a"/>
+    <w:bookmarkEnd w:id="122"/>
+    <w:bookmarkStart w:id="123" w:name="X2159342e28147cb832fdb7750aa47e2f35fe05a"/>
     <w:p>
       <w:pPr>
         <w:pStyle w:val="Heading3"/>
@@ -26220,9 +26385,9 @@
         </w:pict>
       </w:r>
     </w:p>
-    <w:bookmarkEnd w:id="114"/>
-    <w:bookmarkEnd w:id="115"/>
-    <w:bookmarkStart w:id="122" w:name="X0e9b8e8700ad5976390801244ba383e93b1da33"/>
+    <w:bookmarkEnd w:id="123"/>
+    <w:bookmarkEnd w:id="124"/>
+    <w:bookmarkStart w:id="131" w:name="X0e9b8e8700ad5976390801244ba383e93b1da33"/>
     <w:p>
       <w:pPr>
         <w:pStyle w:val="Heading2"/>
@@ -26231,7 +26396,7 @@
         <w:t xml:space="preserve">III.4. Diagnostic des régimes de corrosion (OS3)</w:t>
       </w:r>
     </w:p>
-    <w:bookmarkStart w:id="116" w:name="iii.4.1.-détection-du-régime-stable"/>
+    <w:bookmarkStart w:id="125" w:name="iii.4.1.-détection-du-régime-stable"/>
     <w:p>
       <w:pPr>
         <w:pStyle w:val="Heading3"/>
@@ -26252,8 +26417,8 @@
         <w:t xml:space="preserve">[À compléter — Identification des plages temporelles classifiées « stable » dans les runs 1 et 2. Vérification de la cohérence des seuils empiriques (dR/dt &lt; seuil_stable, tendance_6h ≈ 0).]</w:t>
       </w:r>
     </w:p>
-    <w:bookmarkEnd w:id="116"/>
-    <w:bookmarkStart w:id="117" w:name="X33ac9f7d4d6d075bcc8a23c1d27771c36121776"/>
+    <w:bookmarkEnd w:id="125"/>
+    <w:bookmarkStart w:id="126" w:name="X33ac9f7d4d6d075bcc8a23c1d27771c36121776"/>
     <w:p>
       <w:pPr>
         <w:pStyle w:val="Heading3"/>
@@ -26274,8 +26439,8 @@
         <w:t xml:space="preserve">[À compléter — Identification des phases d’accélération de la corrosion sans inhibiteur. Graphe CR(t) avec annotation des fenêtres classifiées « accélération ».]</w:t>
       </w:r>
     </w:p>
-    <w:bookmarkEnd w:id="117"/>
-    <w:bookmarkStart w:id="118" w:name="X4576a1f1645e91fe985912a5ddb0c2099f28ad1"/>
+    <w:bookmarkEnd w:id="126"/>
+    <w:bookmarkStart w:id="127" w:name="X4576a1f1645e91fe985912a5ddb0c2099f28ad1"/>
     <w:p>
       <w:pPr>
         <w:pStyle w:val="Heading3"/>
@@ -26296,8 +26461,8 @@
         <w:t xml:space="preserve">[À compléter — Identification d’éventuelles phases de passivation observées (CR qui décélère sans inhibiteur). Hypothèse : formation d’un film de phosphate de fer par H₃PO₄. À confirmer par observation visuelle du fil après run.]</w:t>
       </w:r>
     </w:p>
-    <w:bookmarkEnd w:id="118"/>
-    <w:bookmarkStart w:id="119" w:name="X467110b5a02a54db8c09bb4730d3c9d17c26ba5"/>
+    <w:bookmarkEnd w:id="127"/>
+    <w:bookmarkStart w:id="128" w:name="X467110b5a02a54db8c09bb4730d3c9d17c26ba5"/>
     <w:p>
       <w:pPr>
         <w:pStyle w:val="Heading3"/>
@@ -26318,8 +26483,8 @@
         <w:t xml:space="preserve">[À compléter — Pour les runs 3 et 4 : détection du changepoint et classification automatique du régime « adsorption inhibiteur ». Comparaison avec le moment d’injection réel.]</w:t>
       </w:r>
     </w:p>
-    <w:bookmarkEnd w:id="119"/>
-    <w:bookmarkStart w:id="120" w:name="iii.4.5.-détection-du-régime-pré-rupture"/>
+    <w:bookmarkEnd w:id="128"/>
+    <w:bookmarkStart w:id="129" w:name="iii.4.5.-détection-du-régime-pré-rupture"/>
     <w:p>
       <w:pPr>
         <w:pStyle w:val="Heading3"/>
@@ -26340,8 +26505,8 @@
         <w:t xml:space="preserve">[À compléter — Identification des dernières heures avant rupture sur chaque run. Vérification que l’algorithme classifie bien ces fenêtres en « pré-rupture » (RUL &lt; 12 h, dR/dt diverge).]</w:t>
       </w:r>
     </w:p>
-    <w:bookmarkEnd w:id="120"/>
-    <w:bookmarkStart w:id="121" w:name="X8980563796bda59eb74bee35ff0652ea2d66b97"/>
+    <w:bookmarkEnd w:id="129"/>
+    <w:bookmarkStart w:id="130" w:name="X8980563796bda59eb74bee35ff0652ea2d66b97"/>
     <w:p>
       <w:pPr>
         <w:pStyle w:val="Heading3"/>
@@ -26369,9 +26534,9 @@
         </w:pict>
       </w:r>
     </w:p>
-    <w:bookmarkEnd w:id="121"/>
-    <w:bookmarkEnd w:id="122"/>
-    <w:bookmarkStart w:id="126" w:name="Xdd0ae0adf38e9d2a01c3df6274655612da32466"/>
+    <w:bookmarkEnd w:id="130"/>
+    <w:bookmarkEnd w:id="131"/>
+    <w:bookmarkStart w:id="135" w:name="Xdd0ae0adf38e9d2a01c3df6274655612da32466"/>
     <w:p>
       <w:pPr>
         <w:pStyle w:val="Heading2"/>
@@ -26380,7 +26545,7 @@
         <w:t xml:space="preserve">III.5. Évaluation de l’inhibiteur de corrosion et calibration des alertes (OS3)</w:t>
       </w:r>
     </w:p>
-    <w:bookmarkStart w:id="123" w:name="X014464e17f8159f8835c46ac12dee1b4623282f"/>
+    <w:bookmarkStart w:id="132" w:name="X014464e17f8159f8835c46ac12dee1b4623282f"/>
     <w:p>
       <w:pPr>
         <w:pStyle w:val="Heading3"/>
@@ -26401,8 +26566,8 @@
         <w:t xml:space="preserve">[À compléter — Pour les runs 3 et 4 : graphe CR_lisse(t) avec marqueur du changepoint détecté par l’algorithme (chute ≥ 30 % par rapport à la baseline). Comparaison avec t_injection réel. Calcul de Δt_adsorption et discussion (cohérence avec la cinétique de Langmuir).]</w:t>
       </w:r>
     </w:p>
-    <w:bookmarkEnd w:id="123"/>
-    <w:bookmarkStart w:id="124" w:name="Xf285c867fa7c61d7bfd8030a48c41f58e4e7eb5"/>
+    <w:bookmarkEnd w:id="132"/>
+    <w:bookmarkStart w:id="133" w:name="Xf285c867fa7c61d7bfd8030a48c41f58e4e7eb5"/>
     <w:p>
       <w:pPr>
         <w:pStyle w:val="Heading3"/>
@@ -26589,8 +26754,8 @@
         <w:t xml:space="preserve">Discussion des écarts au regard de la composition multi-acide (HCl + H₃PO₄) vs HCl pur des essais fabricant — l’efficacité réelle peut être réduite par l’environnement multi-mécanismes.]</w:t>
       </w:r>
     </w:p>
-    <w:bookmarkEnd w:id="124"/>
-    <w:bookmarkStart w:id="125" w:name="X13f69ce28fd6052b81492647f4edaef3b093a7b"/>
+    <w:bookmarkEnd w:id="133"/>
+    <w:bookmarkStart w:id="134" w:name="X13f69ce28fd6052b81492647f4edaef3b093a7b"/>
     <w:p>
       <w:pPr>
         <w:pStyle w:val="Heading3"/>
@@ -26618,9 +26783,9 @@
         </w:pict>
       </w:r>
     </w:p>
-    <w:bookmarkEnd w:id="125"/>
-    <w:bookmarkEnd w:id="126"/>
-    <w:bookmarkStart w:id="133" w:name="X074284278962b68559762a8516c6a8420c6ece4"/>
+    <w:bookmarkEnd w:id="134"/>
+    <w:bookmarkEnd w:id="135"/>
+    <w:bookmarkStart w:id="142" w:name="X074284278962b68559762a8516c6a8420c6ece4"/>
     <w:p>
       <w:pPr>
         <w:pStyle w:val="Heading2"/>
@@ -26629,7 +26794,7 @@
         <w:t xml:space="preserve">III.6. Intégration au CMMS open-source — démonstration end-to-end et KPIs (OS4)</w:t>
       </w:r>
     </w:p>
-    <w:bookmarkStart w:id="127" w:name="Xe1464985cc037fe747a2001eae0b971ebe4121d"/>
+    <w:bookmarkStart w:id="136" w:name="Xe1464985cc037fe747a2001eae0b971ebe4121d"/>
     <w:p>
       <w:pPr>
         <w:pStyle w:val="Heading3"/>
@@ -26650,8 +26815,8 @@
         <w:t xml:space="preserve">[À compléter — Capture d’écran ou schéma graphique des huit tables Supabase déployées (assets, measurements, predictions, alerts, work_orders, interventions, inhibitor_doses, kpi_maintenance). Vérification de l’intégrité référentielle.]</w:t>
       </w:r>
     </w:p>
-    <w:bookmarkEnd w:id="127"/>
-    <w:bookmarkStart w:id="128" w:name="X529041c1036c1fbb9478ce4da07bad5f4afaf80"/>
+    <w:bookmarkEnd w:id="136"/>
+    <w:bookmarkStart w:id="137" w:name="X529041c1036c1fbb9478ce4da07bad5f4afaf80"/>
     <w:p>
       <w:pPr>
         <w:pStyle w:val="Heading3"/>
@@ -26701,8 +26866,8 @@
         <w:t xml:space="preserve">du dashboard Next.js déployé sur Vercel. Affichage des courbes Rx(t), T(t), CR(t), RUL(t) en temps réel. Liste des alertes actives.]</w:t>
       </w:r>
     </w:p>
-    <w:bookmarkEnd w:id="128"/>
-    <w:bookmarkStart w:id="129" w:name="X1169c4bd386339b829c071b816cb256e503827c"/>
+    <w:bookmarkEnd w:id="137"/>
+    <w:bookmarkStart w:id="138" w:name="X1169c4bd386339b829c071b816cb256e503827c"/>
     <w:p>
       <w:pPr>
         <w:pStyle w:val="Heading3"/>
@@ -26781,8 +26946,8 @@
         <w:t xml:space="preserve">en mode Kanban (Ouvert / En cours / Fermé) ; (iii) détail d’un OT avec formulaire d’intervention. Démontrer la création automatique d’OT depuis une alerte rouge.]</w:t>
       </w:r>
     </w:p>
-    <w:bookmarkEnd w:id="129"/>
-    <w:bookmarkStart w:id="130" w:name="X2780e1b7d62dd546e7eb3a5805c54aa64052ce4"/>
+    <w:bookmarkEnd w:id="138"/>
+    <w:bookmarkStart w:id="139" w:name="X2780e1b7d62dd546e7eb3a5805c54aa64052ce4"/>
     <w:p>
       <w:pPr>
         <w:pStyle w:val="Heading3"/>
@@ -26803,8 +26968,8 @@
         <w:t xml:space="preserve">[À compléter — Capture d’écran de l’historique d’un asset : timeline des alertes, OT, interventions, doses d’inhibiteur injectées. Vérification de la traçabilité ISO 14224.]</w:t>
       </w:r>
     </w:p>
-    <w:bookmarkEnd w:id="130"/>
-    <w:bookmarkStart w:id="131" w:name="iii.6.5.-kpis-maintenance-calculés"/>
+    <w:bookmarkEnd w:id="139"/>
+    <w:bookmarkStart w:id="140" w:name="iii.6.5.-kpis-maintenance-calculés"/>
     <w:p>
       <w:pPr>
         <w:pStyle w:val="Heading3"/>
@@ -27197,8 +27362,8 @@
         <w:t xml:space="preserve">Discussion : ces KPIs n’ont de valeur que sur des volumes significatifs ; les valeurs présentées sont à considérer comme une démonstration de la chaîne de calcul, à confirmer en exploitation industrielle réelle.]</w:t>
       </w:r>
     </w:p>
-    <w:bookmarkEnd w:id="131"/>
-    <w:bookmarkStart w:id="132" w:name="X17affa1188989cc3f315c1c911baccad160fa52"/>
+    <w:bookmarkEnd w:id="140"/>
+    <w:bookmarkStart w:id="141" w:name="X17affa1188989cc3f315c1c911baccad160fa52"/>
     <w:p>
       <w:pPr>
         <w:pStyle w:val="Heading3"/>
@@ -27226,9 +27391,9 @@
         </w:pict>
       </w:r>
     </w:p>
-    <w:bookmarkEnd w:id="132"/>
-    <w:bookmarkEnd w:id="133"/>
-    <w:bookmarkStart w:id="139" w:name="iii.7.-discussions"/>
+    <w:bookmarkEnd w:id="141"/>
+    <w:bookmarkEnd w:id="142"/>
+    <w:bookmarkStart w:id="148" w:name="iii.7.-discussions"/>
     <w:p>
       <w:pPr>
         <w:pStyle w:val="Heading2"/>
@@ -27237,7 +27402,7 @@
         <w:t xml:space="preserve">III.7. Discussions</w:t>
       </w:r>
     </w:p>
-    <w:bookmarkStart w:id="134" w:name="Xf583610808591e0f1deaae25189be6af3381594"/>
+    <w:bookmarkStart w:id="143" w:name="Xf583610808591e0f1deaae25189be6af3381594"/>
     <w:p>
       <w:pPr>
         <w:pStyle w:val="Heading3"/>
@@ -27258,8 +27423,8 @@
         <w:t xml:space="preserve">[À compléter — Comparer la résolution effective obtenue (mΩ) aux spécifications industrielles : Cosasco CW-20, Emerson Roxar, Permasense WT. Discuter le ratio coût/performance — ratio attendu : facteur 40 à 100 moins cher pour une résolution équivalente.]</w:t>
       </w:r>
     </w:p>
-    <w:bookmarkEnd w:id="134"/>
-    <w:bookmarkStart w:id="135" w:name="X2c36353157da6d7de0b42a10a258d8e257ca42b"/>
+    <w:bookmarkEnd w:id="143"/>
+    <w:bookmarkStart w:id="144" w:name="X2c36353157da6d7de0b42a10a258d8e257ca42b"/>
     <w:p>
       <w:pPr>
         <w:pStyle w:val="Heading3"/>
@@ -27340,8 +27505,8 @@
         <w:t xml:space="preserve">Discuter les raisons d’éventuels écarts (taille du jeu de données, type de milieu multi-acide vs corrosion CO₂, protocole RTF).]</w:t>
       </w:r>
     </w:p>
-    <w:bookmarkEnd w:id="135"/>
-    <w:bookmarkStart w:id="136" w:name="X428dcc28753580dfe5a12b3f15afae834a25320"/>
+    <w:bookmarkEnd w:id="144"/>
+    <w:bookmarkStart w:id="145" w:name="X428dcc28753580dfe5a12b3f15afae834a25320"/>
     <w:p>
       <w:pPr>
         <w:pStyle w:val="Heading3"/>
@@ -27362,8 +27527,8 @@
         <w:t xml:space="preserve">[À compléter — Interpréter le temps d’adsorption détecté au regard de la cinétique d’adsorption des imidazolines (Heydari et Talebpour, 2024 ; Wang et al., 2023). Vérifier que η mesuré suit l’isotherme de Langmuir : η(C) = K_ads × C / (1 + K_ads × C).]</w:t>
       </w:r>
     </w:p>
-    <w:bookmarkEnd w:id="136"/>
-    <w:bookmarkStart w:id="137" w:name="Xec02f7cfb27a7f3fb5b1ed0a8b52c108740a54e"/>
+    <w:bookmarkEnd w:id="145"/>
+    <w:bookmarkStart w:id="146" w:name="Xec02f7cfb27a7f3fb5b1ed0a8b52c108740a54e"/>
     <w:p>
       <w:pPr>
         <w:pStyle w:val="Heading3"/>
@@ -27460,8 +27625,8 @@
         <w:t xml:space="preserve">Argumenter que le ratio coût/fonctionnalité ouvre un marché jusqu’ici inaccessible aux PME industrielles subsahariennes.]</w:t>
       </w:r>
     </w:p>
-    <w:bookmarkEnd w:id="137"/>
-    <w:bookmarkStart w:id="138" w:name="iii.7.5.-limites-du-travail"/>
+    <w:bookmarkEnd w:id="146"/>
+    <w:bookmarkStart w:id="147" w:name="iii.7.5.-limites-du-travail"/>
     <w:p>
       <w:pPr>
         <w:pStyle w:val="Heading3"/>
@@ -27607,9 +27772,9 @@
         </w:pict>
       </w:r>
     </w:p>
-    <w:bookmarkEnd w:id="138"/>
-    <w:bookmarkEnd w:id="139"/>
-    <w:bookmarkStart w:id="140" w:name="iii.8.-conclusion-du-chapitre-iii"/>
+    <w:bookmarkEnd w:id="147"/>
+    <w:bookmarkEnd w:id="148"/>
+    <w:bookmarkStart w:id="149" w:name="iii.8.-conclusion-du-chapitre-iii"/>
     <w:p>
       <w:pPr>
         <w:pStyle w:val="Heading2"/>
@@ -27660,9 +27825,9 @@
         <w:t xml:space="preserve">: (i) validation métrologi que de la sonde ER (résolution mΩ obtenue, stabilité), (ii) performance XGBoost (R², RMSE pour CR et RUL ; top-3 SHAP), (iii) diagnostic des régimes (matrice de confusion ; efficacité η mesurée de l’inhibiteur ; seuils calibrés), (iv) prototype GMAO (URL Vercel déployée ; KPIs maintenance calculés ; comparaison fonctionnelle avec GMAO industrielles). Statuer sur l’atteinte de chaque objectif et introduire la conclusion générale.]</w:t>
       </w:r>
     </w:p>
-    <w:bookmarkEnd w:id="140"/>
-    <w:bookmarkEnd w:id="141"/>
-    <w:bookmarkStart w:id="142" w:name="conclusion-générale"/>
+    <w:bookmarkEnd w:id="149"/>
+    <w:bookmarkEnd w:id="150"/>
+    <w:bookmarkStart w:id="151" w:name="conclusion-générale"/>
     <w:p>
       <w:pPr>
         <w:pStyle w:val="Heading1"/>
@@ -28391,8 +28556,8 @@
         <w:t xml:space="preserve">dans le secteur de la maintenance corrosion en Afrique subsaharienne — qu’il s’agisse d’opérateurs majeurs valorisant leurs flux de données existants ou de PME industrielles initiant leur transformation numérique sans investissement initial prohibitif.</w:t>
       </w:r>
     </w:p>
-    <w:bookmarkEnd w:id="142"/>
-    <w:bookmarkStart w:id="143" w:name="références-bibliographiques"/>
+    <w:bookmarkEnd w:id="151"/>
+    <w:bookmarkStart w:id="152" w:name="références-bibliographiques"/>
     <w:p>
       <w:pPr>
         <w:pStyle w:val="Heading1"/>
@@ -30370,8 +30535,8 @@
         <w:t xml:space="preserve">https://vercel.com/</w:t>
       </w:r>
     </w:p>
-    <w:bookmarkEnd w:id="143"/>
-    <w:bookmarkStart w:id="151" w:name="annexes"/>
+    <w:bookmarkEnd w:id="152"/>
+    <w:bookmarkStart w:id="166" w:name="annexes"/>
     <w:p>
       <w:pPr>
         <w:pStyle w:val="Heading1"/>
@@ -30380,7 +30545,7 @@
         <w:t xml:space="preserve">ANNEXES</w:t>
       </w:r>
     </w:p>
-    <w:bookmarkStart w:id="144" w:name="X4a78aeac9d5037a16008a2ee68dd1166d7aa4b4"/>
+    <w:bookmarkStart w:id="153" w:name="X4a78aeac9d5037a16008a2ee68dd1166d7aa4b4"/>
     <w:p>
       <w:pPr>
         <w:pStyle w:val="Heading2"/>
@@ -31232,8 +31397,8 @@
         <w:t xml:space="preserve">.</w:t>
       </w:r>
     </w:p>
-    <w:bookmarkEnd w:id="144"/>
-    <w:bookmarkStart w:id="145" w:name="X89fdaac54454b2f39af1c3d7cfa8452fb9c21c0"/>
+    <w:bookmarkEnd w:id="153"/>
+    <w:bookmarkStart w:id="154" w:name="X89fdaac54454b2f39af1c3d7cfa8452fb9c21c0"/>
     <w:p>
       <w:pPr>
         <w:pStyle w:val="Heading2"/>
@@ -31893,8 +32058,8 @@
         <w:t xml:space="preserve">.</w:t>
       </w:r>
     </w:p>
-    <w:bookmarkEnd w:id="145"/>
-    <w:bookmarkStart w:id="146" w:name="X866633686f9e59acae75a6fcbe6327624079636"/>
+    <w:bookmarkEnd w:id="154"/>
+    <w:bookmarkStart w:id="158" w:name="X866633686f9e59acae75a6fcbe6327624079636"/>
     <w:p>
       <w:pPr>
         <w:pStyle w:val="Heading2"/>
@@ -31905,18 +32070,61 @@
     </w:p>
     <w:p>
       <w:pPr>
-        <w:pStyle w:val="FirstParagraph"/>
-      </w:pPr>
-      <w:r>
-        <w:rPr>
-          <w:i/>
-          <w:iCs/>
-        </w:rPr>
-        <w:t xml:space="preserve">[Schéma à compléter]</w:t>
-      </w:r>
-    </w:p>
-    <w:bookmarkEnd w:id="146"/>
-    <w:bookmarkStart w:id="147" w:name="X8162eba6d3c808a71b484bf89168f5e4ba76936"/>
+        <w:pStyle w:val="CaptionedFigure"/>
+      </w:pPr>
+      <w:r>
+        <w:drawing>
+          <wp:inline>
+            <wp:extent cx="5067300" cy="4422634"/>
+            <wp:effectExtent b="0" l="0" r="0" t="0"/>
+            <wp:docPr descr="Figure C.1 — Schéma de câblage complet : ESP32 + HX711 + Pont de Wheatstone + DS18B20 + cellule HDPE" title="" id="156" name="Picture"/>
+            <a:graphic>
+              <a:graphicData uri="http://schemas.openxmlformats.org/drawingml/2006/picture">
+                <pic:pic>
+                  <pic:nvPicPr>
+                    <pic:cNvPr descr="figures/fig_c1_cablage.png" id="157" name="Picture"/>
+                    <pic:cNvPicPr>
+                      <a:picLocks noChangeArrowheads="1" noChangeAspect="1"/>
+                    </pic:cNvPicPr>
+                  </pic:nvPicPr>
+                  <pic:blipFill>
+                    <a:blip r:embed="rId155"/>
+                    <a:stretch>
+                      <a:fillRect/>
+                    </a:stretch>
+                  </pic:blipFill>
+                  <pic:spPr bwMode="auto">
+                    <a:xfrm>
+                      <a:off x="0" y="0"/>
+                      <a:ext cx="5067300" cy="4422634"/>
+                    </a:xfrm>
+                    <a:prstGeom prst="rect">
+                      <a:avLst/>
+                    </a:prstGeom>
+                    <a:noFill/>
+                    <a:ln w="9525">
+                      <a:noFill/>
+                      <a:headEnd/>
+                      <a:tailEnd/>
+                    </a:ln>
+                  </pic:spPr>
+                </pic:pic>
+              </a:graphicData>
+            </a:graphic>
+          </wp:inline>
+        </w:drawing>
+      </w:r>
+    </w:p>
+    <w:p>
+      <w:pPr>
+        <w:pStyle w:val="ImageCaption"/>
+      </w:pPr>
+      <w:r>
+        <w:t xml:space="preserve">Figure C.1 — Schéma de câblage complet : ESP32 + HX711 + Pont de Wheatstone + DS18B20 + cellule HDPE</w:t>
+      </w:r>
+    </w:p>
+    <w:bookmarkEnd w:id="158"/>
+    <w:bookmarkStart w:id="159" w:name="X8162eba6d3c808a71b484bf89168f5e4ba76936"/>
     <w:p>
       <w:pPr>
         <w:pStyle w:val="Heading2"/>
@@ -32033,8 +32241,8 @@
         <w:t xml:space="preserve">En cas de contact cutané : rincer abondamment à l’eau claire pendant au moins 15 minutes et consulter un médecin.</w:t>
       </w:r>
     </w:p>
-    <w:bookmarkEnd w:id="147"/>
-    <w:bookmarkStart w:id="148" w:name="X42bce5afd9da94b60a13eb14bc7ff64854633a7"/>
+    <w:bookmarkEnd w:id="159"/>
+    <w:bookmarkStart w:id="160" w:name="X42bce5afd9da94b60a13eb14bc7ff64854633a7"/>
     <w:p>
       <w:pPr>
         <w:pStyle w:val="Heading2"/>
@@ -32187,8 +32395,8 @@
         <w:t xml:space="preserve">: récipient hermétique, à l’abri de la chaleur.</w:t>
       </w:r>
     </w:p>
-    <w:bookmarkEnd w:id="148"/>
-    <w:bookmarkStart w:id="149" w:name="Xcc55f5e422aaf19d95dc0e373d45c068519994c"/>
+    <w:bookmarkEnd w:id="160"/>
+    <w:bookmarkStart w:id="164" w:name="Xcc55f5e422aaf19d95dc0e373d45c068519994c"/>
     <w:p>
       <w:pPr>
         <w:pStyle w:val="Heading2"/>
@@ -32199,6 +32407,73 @@
     </w:p>
     <w:p>
       <w:pPr>
+        <w:pStyle w:val="CaptionedFigure"/>
+      </w:pPr>
+      <w:r>
+        <w:drawing>
+          <wp:inline>
+            <wp:extent cx="5067300" cy="3762870"/>
+            <wp:effectExtent b="0" l="0" r="0" t="0"/>
+            <wp:docPr descr="Figure F.1 — Schéma relationnel (ERD) de la base Supabase : 8 tables, clés étrangères en cardinalité 1 — *" title="" id="162" name="Picture"/>
+            <a:graphic>
+              <a:graphicData uri="http://schemas.openxmlformats.org/drawingml/2006/picture">
+                <pic:pic>
+                  <pic:nvPicPr>
+                    <pic:cNvPr descr="figures/fig_f1_erd.png" id="163" name="Picture"/>
+                    <pic:cNvPicPr>
+                      <a:picLocks noChangeArrowheads="1" noChangeAspect="1"/>
+                    </pic:cNvPicPr>
+                  </pic:nvPicPr>
+                  <pic:blipFill>
+                    <a:blip r:embed="rId161"/>
+                    <a:stretch>
+                      <a:fillRect/>
+                    </a:stretch>
+                  </pic:blipFill>
+                  <pic:spPr bwMode="auto">
+                    <a:xfrm>
+                      <a:off x="0" y="0"/>
+                      <a:ext cx="5067300" cy="3762870"/>
+                    </a:xfrm>
+                    <a:prstGeom prst="rect">
+                      <a:avLst/>
+                    </a:prstGeom>
+                    <a:noFill/>
+                    <a:ln w="9525">
+                      <a:noFill/>
+                      <a:headEnd/>
+                      <a:tailEnd/>
+                    </a:ln>
+                  </pic:spPr>
+                </pic:pic>
+              </a:graphicData>
+            </a:graphic>
+          </wp:inline>
+        </w:drawing>
+      </w:r>
+    </w:p>
+    <w:p>
+      <w:pPr>
+        <w:pStyle w:val="ImageCaption"/>
+      </w:pPr>
+      <w:r>
+        <w:t xml:space="preserve">Figure F.1 — Schéma relationnel (ERD) de la base Supabase : 8 tables, clés étrangères en cardinalité 1 — *</w:t>
+      </w:r>
+    </w:p>
+    <w:p>
+      <w:pPr>
+        <w:pStyle w:val="BodyText"/>
+      </w:pPr>
+      <w:r>
+        <w:rPr>
+          <w:b/>
+          <w:bCs/>
+        </w:rPr>
+        <w:t xml:space="preserve">Définitions SQL des tables :</w:t>
+      </w:r>
+    </w:p>
+    <w:p>
+      <w:pPr>
         <w:pStyle w:val="SourceCode"/>
       </w:pPr>
       <w:r>
@@ -34155,8 +34430,8 @@
         <w:t xml:space="preserve"> asset_id;</w:t>
       </w:r>
     </w:p>
-    <w:bookmarkEnd w:id="149"/>
-    <w:bookmarkStart w:id="150" w:name="annexe-g-liste-des-fichiers-du-projet"/>
+    <w:bookmarkEnd w:id="164"/>
+    <w:bookmarkStart w:id="165" w:name="annexe-g-liste-des-fichiers-du-projet"/>
     <w:p>
       <w:pPr>
         <w:pStyle w:val="Heading2"/>
@@ -34383,9 +34658,9 @@
         <w:t xml:space="preserve">londola13/predictive-maintenance-corrosion</w:t>
       </w:r>
     </w:p>
-    <w:bookmarkEnd w:id="150"/>
-    <w:bookmarkEnd w:id="151"/>
-    <w:bookmarkStart w:id="152" w:name="table-des-matières"/>
+    <w:bookmarkEnd w:id="165"/>
+    <w:bookmarkEnd w:id="166"/>
+    <w:bookmarkStart w:id="167" w:name="table-des-matières"/>
     <w:p>
       <w:pPr>
         <w:pStyle w:val="Heading1"/>
@@ -34406,7 +34681,7 @@
         <w:t xml:space="preserve">(générée automatiquement par Word à partir des styles Heading 1 / 2 / 3)</w:t>
       </w:r>
     </w:p>
-    <w:bookmarkEnd w:id="152"/>
+    <w:bookmarkEnd w:id="167"/>
     <w:sectPr>
       <w:footnotePr>
         <w:numRestart w:val="eachSect"/>

</xml_diff>